<commit_message>
refactor: update feature traceability matrix, data definitions, and reporting scripts for SolarKits v2.0
</commit_message>
<xml_diff>
--- a/SolarKits_Project_Development_Status_Report.docx
+++ b/SolarKits_Project_Development_Status_Report.docx
@@ -86,7 +86,7 @@
                 <w:color w:val="0F172A"/>
                 <w:sz w:val="17"/>
               </w:rPr>
-              <w:t>September 25, 2026 (Updated from August 29, 2026)</w:t>
+              <w:t>October 10, 2026 (Updated from August 29, 2026)</w:t>
             </w:r>
           </w:p>
         </w:tc>
@@ -495,7 +495,7 @@
                 <w:color w:val="0F2552"/>
                 <w:sz w:val="32"/>
               </w:rPr>
-              <w:t>7</w:t>
+              <w:t>6</w:t>
             </w:r>
           </w:p>
         </w:tc>
@@ -684,7 +684,7 @@
           <w:color w:val="0F172A"/>
           <w:sz w:val="18"/>
         </w:rPr>
-        <w:t>SolarKits v2.0 is an enterprise-grade multi-tenant B2B Solar E-Commerce, Channel Distribution, and Operations Ecosystem connecting EPC Contractors, Regional Franchise Partners, BOS Distributors &amp; Dealers, Multi-State Warehouses, Accounts, Logistics Operations, and Central Administrators. Powered by a modern microservices-adjacent architecture utilizing Node.js/Express 5, MongoDB Multi-Database, React 19, and Vite 7, the platform bridges physical solar supply chain fulfillment with automated corporate banking.</w:t>
+        <w:t>SolarKits v2.0 is an enterprise-grade multi-tenant B2B Solar E-Commerce, Channel Distribution, and Operations Ecosystem connecting B2B Solar EPC Contractors, Regional Franchise Partners, Multi-State Warehouses, Accounts &amp; Finance, Logistics Operations, and Central Administrators. Powered by a modern microservices-adjacent architecture utilizing Node.js/Express 5, MongoDB Multi-Database, React 19, and Vite 7, the platform bridges physical solar supply chain fulfillment with automated corporate banking.</w:t>
         <w:br/>
         <w:br/>
         <w:t>Hybrid Enterprise Payment Architecture: The commercial infrastructure operates on dual payment rails:</w:t>
@@ -694,7 +694,7 @@
         <w:t>2. Offline Bank Transfer &amp; Payment Receipt Upload Engine: Facilitates high-value manual transfers via NEFT, RTGS, IMPS, or Cheque. Users upload bank transfer slips and log UTR numbers, which are audited by the Accounts team against bank statements before releasing warehouse dispatches or Franchise Earning disbursements.</w:t>
         <w:br/>
         <w:br/>
-        <w:t>Physical Delivery Logistics: Full 8-stage order lifecycle tracking (Confirmed → Processing → Vehicle Assigned → Ready for Dispatch → Dispatched → In Transit → Destination Reached → Delivered / POD Confirmed) paired with smart fleet auto-recommendation based on vehicle payload (kg), max kit limits, and serviceable geographic districts.</w:t>
+        <w:t>2-Stage Kit Activation &amp; Physical Delivery Logistics: Full 2-stage governance pipeline (Stage 1: Warehouse Kit Activation with 3 prerequisite validation gates; Stage 2: District Order Management sequential routing) alongside an 8-stage order lifecycle tracking system (Confirmed → Processing → Vehicle Assigned → Ready for Dispatch → Dispatched → In Transit → Destination Reached → Delivered / POD Confirmed) paired with smart fleet auto-recommendation based on vehicle payload (kg), max kit limits, and serviceable geographic districts.</w:t>
       </w:r>
     </w:p>
     <w:p>
@@ -2376,7 +2376,7 @@
                 <w:color w:val="0F172A"/>
                 <w:sz w:val="16"/>
               </w:rPr>
-              <w:t>BOSKIT B2B Platform</w:t>
+              <w:t>BDE Field Agent Portal</w:t>
             </w:r>
           </w:p>
         </w:tc>
@@ -2398,7 +2398,7 @@
                 <w:color w:val="0F172A"/>
                 <w:sz w:val="16"/>
               </w:rPr>
-              <w:t>customer-apps/boskit-website</w:t>
+              <w:t>customer-apps/BDE-modules</w:t>
             </w:r>
           </w:p>
         </w:tc>
@@ -2420,7 +2420,7 @@
                 <w:color w:val="0F172A"/>
                 <w:sz w:val="16"/>
               </w:rPr>
-              <w:t>5180</w:t>
+              <w:t>Standalone</w:t>
             </w:r>
           </w:p>
         </w:tc>
@@ -2442,7 +2442,7 @@
                 <w:color w:val="0F172A"/>
                 <w:sz w:val="16"/>
               </w:rPr>
-              <w:t>React 19, Tailwind v4, Distributor Onboarding, Procurement Catalog, Dealer Portal, Custom Kit Configurator</w:t>
+              <w:t>React 19, Vite, Tailwind CSS, Lead Conversion Funnel, Store Inspection, Monthly Target Goals Tracker</w:t>
             </w:r>
           </w:p>
         </w:tc>
@@ -2472,140 +2472,6 @@
           <w:tcPr>
             <w:tcW w:type="dxa" w:w="1752"/>
             <w:shd w:fill="F8FAFC"/>
-            <w:tcMar>
-              <w:top w:w="80" w:type="dxa"/>
-              <w:bottom w:w="80" w:type="dxa"/>
-              <w:left w:w="120" w:type="dxa"/>
-              <w:right w:w="120" w:type="dxa"/>
-            </w:tcMar>
-          </w:tcPr>
-          <w:p>
-            <w:r>
-              <w:rPr>
-                <w:rFonts w:ascii="Arial" w:hAnsi="Arial"/>
-                <w:color w:val="0F172A"/>
-                <w:sz w:val="16"/>
-              </w:rPr>
-              <w:t>80%</w:t>
-            </w:r>
-          </w:p>
-        </w:tc>
-      </w:tr>
-      <w:tr>
-        <w:tc>
-          <w:tcPr>
-            <w:tcW w:type="dxa" w:w="1752"/>
-            <w:shd w:fill="FFFFFF"/>
-            <w:tcMar>
-              <w:top w:w="80" w:type="dxa"/>
-              <w:bottom w:w="80" w:type="dxa"/>
-              <w:left w:w="120" w:type="dxa"/>
-              <w:right w:w="120" w:type="dxa"/>
-            </w:tcMar>
-          </w:tcPr>
-          <w:p>
-            <w:r>
-              <w:rPr>
-                <w:rFonts w:ascii="Arial" w:hAnsi="Arial"/>
-                <w:color w:val="0F172A"/>
-                <w:sz w:val="16"/>
-              </w:rPr>
-              <w:t>BDE Field Agent Portal</w:t>
-            </w:r>
-          </w:p>
-        </w:tc>
-        <w:tc>
-          <w:tcPr>
-            <w:tcW w:type="dxa" w:w="1752"/>
-            <w:shd w:fill="FFFFFF"/>
-            <w:tcMar>
-              <w:top w:w="80" w:type="dxa"/>
-              <w:bottom w:w="80" w:type="dxa"/>
-              <w:left w:w="120" w:type="dxa"/>
-              <w:right w:w="120" w:type="dxa"/>
-            </w:tcMar>
-          </w:tcPr>
-          <w:p>
-            <w:r>
-              <w:rPr>
-                <w:rFonts w:ascii="Arial" w:hAnsi="Arial"/>
-                <w:color w:val="0F172A"/>
-                <w:sz w:val="16"/>
-              </w:rPr>
-              <w:t>customer-apps/BDE-modules</w:t>
-            </w:r>
-          </w:p>
-        </w:tc>
-        <w:tc>
-          <w:tcPr>
-            <w:tcW w:type="dxa" w:w="1752"/>
-            <w:shd w:fill="FFFFFF"/>
-            <w:tcMar>
-              <w:top w:w="80" w:type="dxa"/>
-              <w:bottom w:w="80" w:type="dxa"/>
-              <w:left w:w="120" w:type="dxa"/>
-              <w:right w:w="120" w:type="dxa"/>
-            </w:tcMar>
-          </w:tcPr>
-          <w:p>
-            <w:r>
-              <w:rPr>
-                <w:rFonts w:ascii="Arial" w:hAnsi="Arial"/>
-                <w:color w:val="0F172A"/>
-                <w:sz w:val="16"/>
-              </w:rPr>
-              <w:t>Standalone</w:t>
-            </w:r>
-          </w:p>
-        </w:tc>
-        <w:tc>
-          <w:tcPr>
-            <w:tcW w:type="dxa" w:w="1752"/>
-            <w:shd w:fill="FFFFFF"/>
-            <w:tcMar>
-              <w:top w:w="80" w:type="dxa"/>
-              <w:bottom w:w="80" w:type="dxa"/>
-              <w:left w:w="120" w:type="dxa"/>
-              <w:right w:w="120" w:type="dxa"/>
-            </w:tcMar>
-          </w:tcPr>
-          <w:p>
-            <w:r>
-              <w:rPr>
-                <w:rFonts w:ascii="Arial" w:hAnsi="Arial"/>
-                <w:color w:val="0F172A"/>
-                <w:sz w:val="16"/>
-              </w:rPr>
-              <w:t>React 19, Vite, Tailwind CSS, Lead Conversion Funnel, Store Inspection, Monthly Target Goals Tracker</w:t>
-            </w:r>
-          </w:p>
-        </w:tc>
-        <w:tc>
-          <w:tcPr>
-            <w:tcW w:type="dxa" w:w="1752"/>
-            <w:shd w:fill="FFFFFF"/>
-            <w:tcMar>
-              <w:top w:w="80" w:type="dxa"/>
-              <w:bottom w:w="80" w:type="dxa"/>
-              <w:left w:w="120" w:type="dxa"/>
-              <w:right w:w="120" w:type="dxa"/>
-            </w:tcMar>
-          </w:tcPr>
-          <w:p>
-            <w:r>
-              <w:rPr>
-                <w:rFonts w:ascii="Arial" w:hAnsi="Arial"/>
-                <w:color w:val="0F172A"/>
-                <w:sz w:val="16"/>
-              </w:rPr>
-              <w:t>Operational</w:t>
-            </w:r>
-          </w:p>
-        </w:tc>
-        <w:tc>
-          <w:tcPr>
-            <w:tcW w:type="dxa" w:w="1752"/>
-            <w:shd w:fill="FFFFFF"/>
             <w:tcMar>
               <w:top w:w="80" w:type="dxa"/>
               <w:bottom w:w="80" w:type="dxa"/>
@@ -3034,7 +2900,7 @@
                 <w:color w:val="0F172A"/>
                 <w:sz w:val="16"/>
               </w:rPr>
-              <w:t>7 isolated logical databases for enterprise multi-tenancy</w:t>
+              <w:t>6 isolated logical databases for enterprise multi-tenancy</w:t>
             </w:r>
           </w:p>
         </w:tc>
@@ -3238,7 +3104,7 @@
                 <w:color w:val="0F172A"/>
                 <w:sz w:val="16"/>
               </w:rPr>
-              <w:t>v19.x across all 7 customer and admin portals</w:t>
+              <w:t>v19.x across all 6 customer and admin portals</w:t>
             </w:r>
           </w:p>
         </w:tc>
@@ -4283,7 +4149,7 @@
                 <w:color w:val="0F172A"/>
                 <w:sz w:val="16"/>
               </w:rPr>
-              <w:t>products, product_templates, solar_kits, combo_kits, combo_kit_variants, industry_types, project_categories, brands, warehouses, po_settings, commission_rules, moq_rules, website_content, industry_content, geolocation</w:t>
+              <w:t>products, product_templates, solar_kits, combo_kits, combo_kit_variants, warehouse_kit_activations, order_settings, industry_types, project_categories, brands, warehouses, po_settings, commission_rules, moq_rules, website_content, industry_content, geolocation</w:t>
             </w:r>
           </w:p>
         </w:tc>
@@ -4373,7 +4239,7 @@
                 <w:color w:val="0F172A"/>
                 <w:sz w:val="16"/>
               </w:rPr>
-              <w:t>epc_accounts, bos_kits, cart, offer_masters, request_orders, solarshop_settings, inventory_reservations, reseller_wallets, reseller_ledger, reseller_plan_subscriptions, delivery_order, delivery_route_setting, delivery_service_provider, delivery_vehicle_fleet, delivery_cost_benchmark, solarkits_service_tickets, icici_collection_logs</w:t>
+              <w:t>epc_accounts, cart, offer_masters, request_orders, solarshop_settings, inventory_reservations, reseller_wallets, reseller_ledger, reseller_plan_subscriptions, delivery_order, delivery_route_setting, delivery_service_provider, delivery_vehicle_fleet, delivery_cost_benchmark, solarkits_service_tickets, icici_collection_logs</w:t>
             </w:r>
           </w:p>
         </w:tc>
@@ -4419,7 +4285,7 @@
                 <w:color w:val="0F172A"/>
                 <w:sz w:val="16"/>
               </w:rPr>
-              <w:t>boskit_db</w:t>
+              <w:t>company_warehouse_db</w:t>
             </w:r>
           </w:p>
         </w:tc>
@@ -4441,7 +4307,7 @@
                 <w:color w:val="0F172A"/>
                 <w:sz w:val="16"/>
               </w:rPr>
-              <w:t>27 schemas</w:t>
+              <w:t>14 schemas</w:t>
             </w:r>
           </w:p>
         </w:tc>
@@ -4463,7 +4329,7 @@
                 <w:color w:val="0F172A"/>
                 <w:sz w:val="16"/>
               </w:rPr>
-              <w:t>boskit_distributors, boskit_dealers, boskit_distributor_plans, boskit_orders, boskit_payments, boskit_commissions, boskit_notifications, boskit_territories, boskit_moq_rules, boskit_tax_rules, boskit_channel_settings, boskit_plan_versions</w:t>
+              <w:t>company_warehouses, stock inward logs, SKU serials, DeliveryDriver, DeliveryVehicle, WarehouseStock, WarehouseInward, PoRequest, PurchaseOrder, ValidationField</w:t>
             </w:r>
           </w:p>
         </w:tc>
@@ -4485,7 +4351,7 @@
                 <w:color w:val="0F172A"/>
                 <w:sz w:val="16"/>
               </w:rPr>
-              <w:t>BOSKIT Platform &amp; BOSKIT Admin</w:t>
+              <w:t>Warehouse Panel, Accounts Panel, Operations Dispatch</w:t>
             </w:r>
           </w:p>
         </w:tc>
@@ -4509,7 +4375,7 @@
                 <w:color w:val="0F172A"/>
                 <w:sz w:val="16"/>
               </w:rPr>
-              <w:t>company_warehouse_db</w:t>
+              <w:t>geolocation_db</w:t>
             </w:r>
           </w:p>
         </w:tc>
@@ -4531,7 +4397,7 @@
                 <w:color w:val="0F172A"/>
                 <w:sz w:val="16"/>
               </w:rPr>
-              <w:t>14 schemas</w:t>
+              <w:t>5 schemas</w:t>
             </w:r>
           </w:p>
         </w:tc>
@@ -4553,7 +4419,7 @@
                 <w:color w:val="0F172A"/>
                 <w:sz w:val="16"/>
               </w:rPr>
-              <w:t>company_warehouses, stock inward logs, SKU serials, DeliveryDriver, DeliveryVehicle, WarehouseStock, WarehouseInward, PoRequest, PurchaseOrder, ValidationField</w:t>
+              <w:t>countries, states, districts, multi-state clusters, pincodes, territory boundaries</w:t>
             </w:r>
           </w:p>
         </w:tc>
@@ -4575,7 +4441,7 @@
                 <w:color w:val="0F172A"/>
                 <w:sz w:val="16"/>
               </w:rPr>
-              <w:t>Warehouse Panel, Accounts Panel, Operations Dispatch</w:t>
+              <w:t>All territory-aware and delivery-aware modules</w:t>
             </w:r>
           </w:p>
         </w:tc>
@@ -4599,7 +4465,7 @@
                 <w:color w:val="0F172A"/>
                 <w:sz w:val="16"/>
               </w:rPr>
-              <w:t>geolocation_db</w:t>
+              <w:t>supplier_db</w:t>
             </w:r>
           </w:p>
         </w:tc>
@@ -4621,7 +4487,7 @@
                 <w:color w:val="0F172A"/>
                 <w:sz w:val="16"/>
               </w:rPr>
-              <w:t>5 schemas</w:t>
+              <w:t>4 schemas</w:t>
             </w:r>
           </w:p>
         </w:tc>
@@ -4643,7 +4509,7 @@
                 <w:color w:val="0F172A"/>
                 <w:sz w:val="16"/>
               </w:rPr>
-              <w:t>countries, states, districts, multi-state clusters, pincodes, territory boundaries</w:t>
+              <w:t>suppliers, brands, supplier_contracts, bid_records, supply_agreements</w:t>
             </w:r>
           </w:p>
         </w:tc>
@@ -4651,96 +4517,6 @@
           <w:tcPr>
             <w:tcW w:type="dxa" w:w="2628"/>
             <w:shd w:fill="F8FAFC"/>
-            <w:tcMar>
-              <w:top w:w="80" w:type="dxa"/>
-              <w:bottom w:w="80" w:type="dxa"/>
-              <w:left w:w="120" w:type="dxa"/>
-              <w:right w:w="120" w:type="dxa"/>
-            </w:tcMar>
-          </w:tcPr>
-          <w:p>
-            <w:r>
-              <w:rPr>
-                <w:rFonts w:ascii="Arial" w:hAnsi="Arial"/>
-                <w:color w:val="0F172A"/>
-                <w:sz w:val="16"/>
-              </w:rPr>
-              <w:t>All territory-aware and delivery-aware modules</w:t>
-            </w:r>
-          </w:p>
-        </w:tc>
-      </w:tr>
-      <w:tr>
-        <w:tc>
-          <w:tcPr>
-            <w:tcW w:type="dxa" w:w="2628"/>
-            <w:shd w:fill="FFFFFF"/>
-            <w:tcMar>
-              <w:top w:w="80" w:type="dxa"/>
-              <w:bottom w:w="80" w:type="dxa"/>
-              <w:left w:w="120" w:type="dxa"/>
-              <w:right w:w="120" w:type="dxa"/>
-            </w:tcMar>
-          </w:tcPr>
-          <w:p>
-            <w:r>
-              <w:rPr>
-                <w:rFonts w:ascii="Arial" w:hAnsi="Arial"/>
-                <w:color w:val="0F172A"/>
-                <w:sz w:val="16"/>
-              </w:rPr>
-              <w:t>supplier_db</w:t>
-            </w:r>
-          </w:p>
-        </w:tc>
-        <w:tc>
-          <w:tcPr>
-            <w:tcW w:type="dxa" w:w="2628"/>
-            <w:shd w:fill="FFFFFF"/>
-            <w:tcMar>
-              <w:top w:w="80" w:type="dxa"/>
-              <w:bottom w:w="80" w:type="dxa"/>
-              <w:left w:w="120" w:type="dxa"/>
-              <w:right w:w="120" w:type="dxa"/>
-            </w:tcMar>
-          </w:tcPr>
-          <w:p>
-            <w:r>
-              <w:rPr>
-                <w:rFonts w:ascii="Arial" w:hAnsi="Arial"/>
-                <w:color w:val="0F172A"/>
-                <w:sz w:val="16"/>
-              </w:rPr>
-              <w:t>4 schemas</w:t>
-            </w:r>
-          </w:p>
-        </w:tc>
-        <w:tc>
-          <w:tcPr>
-            <w:tcW w:type="dxa" w:w="2628"/>
-            <w:shd w:fill="FFFFFF"/>
-            <w:tcMar>
-              <w:top w:w="80" w:type="dxa"/>
-              <w:bottom w:w="80" w:type="dxa"/>
-              <w:left w:w="120" w:type="dxa"/>
-              <w:right w:w="120" w:type="dxa"/>
-            </w:tcMar>
-          </w:tcPr>
-          <w:p>
-            <w:r>
-              <w:rPr>
-                <w:rFonts w:ascii="Arial" w:hAnsi="Arial"/>
-                <w:color w:val="0F172A"/>
-                <w:sz w:val="16"/>
-              </w:rPr>
-              <w:t>suppliers, brands, supplier contracts, bid records, supply agreements</w:t>
-            </w:r>
-          </w:p>
-        </w:tc>
-        <w:tc>
-          <w:tcPr>
-            <w:tcW w:type="dxa" w:w="2628"/>
-            <w:shd w:fill="FFFFFF"/>
             <w:tcMar>
               <w:top w:w="80" w:type="dxa"/>
               <w:bottom w:w="80" w:type="dxa"/>
@@ -5070,7 +4846,7 @@
                 <w:color w:val="0F172A"/>
                 <w:sz w:val="16"/>
               </w:rPr>
-              <w:t>Offline receipt verification, ICICI reconciliation, GST invoicing, PO approval, supplier registry, Franchise Earning manual bank payouts</w:t>
+              <w:t>Offline receipt verification, multi-order supplier PO combination &amp; payment, ICICI reconciliation, GST invoicing, supplier registry, Franchise Earning manual bank payouts</w:t>
             </w:r>
           </w:p>
         </w:tc>
@@ -5160,7 +4936,7 @@
                 <w:color w:val="0F172A"/>
                 <w:sz w:val="16"/>
               </w:rPr>
-              <w:t>Material inward, outward dispatch, barcode/serial scanning, fleet vehicle &amp; driver tracking, damaged stock adjustments</w:t>
+              <w:t>Material inward (PO delivery &amp; GRN generation), FIFO stock availability check, outward dispatch, barcode/serial scanning, fleet vehicle &amp; driver tracking, damaged stock adjustments</w:t>
             </w:r>
           </w:p>
         </w:tc>
@@ -5250,7 +5026,7 @@
                 <w:color w:val="0F172A"/>
                 <w:sz w:val="16"/>
               </w:rPr>
-              <w:t>8-stage order delivery management, Delivery Queue (Tab 7), vehicle recommendations, Trip Tracking &amp; POD (Tab 8)</w:t>
+              <w:t>8-stage order delivery management, Delivery Queue (Tab 7), vehicle recommendations, Trip Tracking &amp; POD confirmation (Tab 8)</w:t>
             </w:r>
           </w:p>
         </w:tc>
@@ -5520,7 +5296,7 @@
                 <w:color w:val="0F172A"/>
                 <w:sz w:val="16"/>
               </w:rPr>
-              <w:t>KYC submission, loose kit ordering, PO creation, EPC buyer management, wallet earnings, ICICI live stream, service tickets</w:t>
+              <w:t>KYC submission, loose kit ordering (1,205 LOC), PO creation, EPC buyer management, wallet earnings, ICICI live stream, service tickets</w:t>
             </w:r>
           </w:p>
         </w:tc>
@@ -5610,7 +5386,7 @@
                 <w:color w:val="0F172A"/>
                 <w:sz w:val="16"/>
               </w:rPr>
-              <w:t>Combo kit purchasing, custom kit config, Know My Margin estimator, bulk buy cart, 8-stage order tracking</w:t>
+              <w:t>Preconfigured combo kits, dynamic BOM customizer, Know My Margin estimator, bulk buy cart, 8-stage order tracking</w:t>
             </w:r>
           </w:p>
         </w:tc>
@@ -5634,7 +5410,7 @@
                 <w:color w:val="0F172A"/>
                 <w:sz w:val="16"/>
               </w:rPr>
-              <w:t>BOSKIT Distributor</w:t>
+              <w:t>Supplier</w:t>
             </w:r>
           </w:p>
         </w:tc>
@@ -5656,7 +5432,7 @@
                 <w:color w:val="0F172A"/>
                 <w:sz w:val="16"/>
               </w:rPr>
-              <w:t>BOSKIT Website + Admin</w:t>
+              <w:t>Supplier Portal (API)</w:t>
             </w:r>
           </w:p>
         </w:tc>
@@ -5678,7 +5454,7 @@
                 <w:color w:val="0F172A"/>
                 <w:sz w:val="16"/>
               </w:rPr>
-              <w:t>BOSKIT Auth</w:t>
+              <w:t>Supplier Auth</w:t>
             </w:r>
           </w:p>
         </w:tc>
@@ -5700,277 +5476,7 @@
                 <w:color w:val="0F172A"/>
                 <w:sz w:val="16"/>
               </w:rPr>
-              <w:t>Plan enrollment, territory exclusivity, master trade catalog procurement, downstream dealer network governance</w:t>
-            </w:r>
-          </w:p>
-        </w:tc>
-      </w:tr>
-      <w:tr>
-        <w:tc>
-          <w:tcPr>
-            <w:tcW w:type="dxa" w:w="2628"/>
-            <w:shd w:fill="F8FAFC"/>
-            <w:tcMar>
-              <w:top w:w="80" w:type="dxa"/>
-              <w:bottom w:w="80" w:type="dxa"/>
-              <w:left w:w="120" w:type="dxa"/>
-              <w:right w:w="120" w:type="dxa"/>
-            </w:tcMar>
-          </w:tcPr>
-          <w:p>
-            <w:r>
-              <w:rPr>
-                <w:rFonts w:ascii="Arial" w:hAnsi="Arial"/>
-                <w:color w:val="0F172A"/>
-                <w:sz w:val="16"/>
-              </w:rPr>
-              <w:t>BOSKIT Dealer</w:t>
-            </w:r>
-          </w:p>
-        </w:tc>
-        <w:tc>
-          <w:tcPr>
-            <w:tcW w:type="dxa" w:w="2628"/>
-            <w:shd w:fill="F8FAFC"/>
-            <w:tcMar>
-              <w:top w:w="80" w:type="dxa"/>
-              <w:bottom w:w="80" w:type="dxa"/>
-              <w:left w:w="120" w:type="dxa"/>
-              <w:right w:w="120" w:type="dxa"/>
-            </w:tcMar>
-          </w:tcPr>
-          <w:p>
-            <w:r>
-              <w:rPr>
-                <w:rFonts w:ascii="Arial" w:hAnsi="Arial"/>
-                <w:color w:val="0F172A"/>
-                <w:sz w:val="16"/>
-              </w:rPr>
-              <w:t>BOSKIT Website</w:t>
-            </w:r>
-          </w:p>
-        </w:tc>
-        <w:tc>
-          <w:tcPr>
-            <w:tcW w:type="dxa" w:w="2628"/>
-            <w:shd w:fill="F8FAFC"/>
-            <w:tcMar>
-              <w:top w:w="80" w:type="dxa"/>
-              <w:bottom w:w="80" w:type="dxa"/>
-              <w:left w:w="120" w:type="dxa"/>
-              <w:right w:w="120" w:type="dxa"/>
-            </w:tcMar>
-          </w:tcPr>
-          <w:p>
-            <w:r>
-              <w:rPr>
-                <w:rFonts w:ascii="Arial" w:hAnsi="Arial"/>
-                <w:color w:val="0F172A"/>
-                <w:sz w:val="16"/>
-              </w:rPr>
-              <w:t>BOSKIT Auth</w:t>
-            </w:r>
-          </w:p>
-        </w:tc>
-        <w:tc>
-          <w:tcPr>
-            <w:tcW w:type="dxa" w:w="2628"/>
-            <w:shd w:fill="F8FAFC"/>
-            <w:tcMar>
-              <w:top w:w="80" w:type="dxa"/>
-              <w:bottom w:w="80" w:type="dxa"/>
-              <w:left w:w="120" w:type="dxa"/>
-              <w:right w:w="120" w:type="dxa"/>
-            </w:tcMar>
-          </w:tcPr>
-          <w:p>
-            <w:r>
-              <w:rPr>
-                <w:rFonts w:ascii="Arial" w:hAnsi="Arial"/>
-                <w:color w:val="0F172A"/>
-                <w:sz w:val="16"/>
-              </w:rPr>
-              <w:t>Electrical BOS procurement, catalog ordering, distributor margin visibility, shipment tracking</w:t>
-            </w:r>
-          </w:p>
-        </w:tc>
-      </w:tr>
-      <w:tr>
-        <w:tc>
-          <w:tcPr>
-            <w:tcW w:type="dxa" w:w="2628"/>
-            <w:shd w:fill="FFFFFF"/>
-            <w:tcMar>
-              <w:top w:w="80" w:type="dxa"/>
-              <w:bottom w:w="80" w:type="dxa"/>
-              <w:left w:w="120" w:type="dxa"/>
-              <w:right w:w="120" w:type="dxa"/>
-            </w:tcMar>
-          </w:tcPr>
-          <w:p>
-            <w:r>
-              <w:rPr>
-                <w:rFonts w:ascii="Arial" w:hAnsi="Arial"/>
-                <w:color w:val="0F172A"/>
-                <w:sz w:val="16"/>
-              </w:rPr>
-              <w:t>BOSKIT Admin</w:t>
-            </w:r>
-          </w:p>
-        </w:tc>
-        <w:tc>
-          <w:tcPr>
-            <w:tcW w:type="dxa" w:w="2628"/>
-            <w:shd w:fill="FFFFFF"/>
-            <w:tcMar>
-              <w:top w:w="80" w:type="dxa"/>
-              <w:bottom w:w="80" w:type="dxa"/>
-              <w:left w:w="120" w:type="dxa"/>
-              <w:right w:w="120" w:type="dxa"/>
-            </w:tcMar>
-          </w:tcPr>
-          <w:p>
-            <w:r>
-              <w:rPr>
-                <w:rFonts w:ascii="Arial" w:hAnsi="Arial"/>
-                <w:color w:val="0F172A"/>
-                <w:sz w:val="16"/>
-              </w:rPr>
-              <w:t>Admin Portal (/boskit-admin/*)</w:t>
-            </w:r>
-          </w:p>
-        </w:tc>
-        <w:tc>
-          <w:tcPr>
-            <w:tcW w:type="dxa" w:w="2628"/>
-            <w:shd w:fill="FFFFFF"/>
-            <w:tcMar>
-              <w:top w:w="80" w:type="dxa"/>
-              <w:bottom w:w="80" w:type="dxa"/>
-              <w:left w:w="120" w:type="dxa"/>
-              <w:right w:w="120" w:type="dxa"/>
-            </w:tcMar>
-          </w:tcPr>
-          <w:p>
-            <w:r>
-              <w:rPr>
-                <w:rFonts w:ascii="Arial" w:hAnsi="Arial"/>
-                <w:color w:val="0F172A"/>
-                <w:sz w:val="16"/>
-              </w:rPr>
-              <w:t>CMS Auth</w:t>
-            </w:r>
-          </w:p>
-        </w:tc>
-        <w:tc>
-          <w:tcPr>
-            <w:tcW w:type="dxa" w:w="2628"/>
-            <w:shd w:fill="FFFFFF"/>
-            <w:tcMar>
-              <w:top w:w="80" w:type="dxa"/>
-              <w:bottom w:w="80" w:type="dxa"/>
-              <w:left w:w="120" w:type="dxa"/>
-              <w:right w:w="120" w:type="dxa"/>
-            </w:tcMar>
-          </w:tcPr>
-          <w:p>
-            <w:r>
-              <w:rPr>
-                <w:rFonts w:ascii="Arial" w:hAnsi="Arial"/>
-                <w:color w:val="0F172A"/>
-                <w:sz w:val="16"/>
-              </w:rPr>
-              <w:t>Distributor approvals, tier plan configuration, territory allocation, MOQ and HSN tax management</w:t>
-            </w:r>
-          </w:p>
-        </w:tc>
-      </w:tr>
-      <w:tr>
-        <w:tc>
-          <w:tcPr>
-            <w:tcW w:type="dxa" w:w="2628"/>
-            <w:shd w:fill="F8FAFC"/>
-            <w:tcMar>
-              <w:top w:w="80" w:type="dxa"/>
-              <w:bottom w:w="80" w:type="dxa"/>
-              <w:left w:w="120" w:type="dxa"/>
-              <w:right w:w="120" w:type="dxa"/>
-            </w:tcMar>
-          </w:tcPr>
-          <w:p>
-            <w:r>
-              <w:rPr>
-                <w:rFonts w:ascii="Arial" w:hAnsi="Arial"/>
-                <w:color w:val="0F172A"/>
-                <w:sz w:val="16"/>
-              </w:rPr>
-              <w:t>Supplier</w:t>
-            </w:r>
-          </w:p>
-        </w:tc>
-        <w:tc>
-          <w:tcPr>
-            <w:tcW w:type="dxa" w:w="2628"/>
-            <w:shd w:fill="F8FAFC"/>
-            <w:tcMar>
-              <w:top w:w="80" w:type="dxa"/>
-              <w:bottom w:w="80" w:type="dxa"/>
-              <w:left w:w="120" w:type="dxa"/>
-              <w:right w:w="120" w:type="dxa"/>
-            </w:tcMar>
-          </w:tcPr>
-          <w:p>
-            <w:r>
-              <w:rPr>
-                <w:rFonts w:ascii="Arial" w:hAnsi="Arial"/>
-                <w:color w:val="0F172A"/>
-                <w:sz w:val="16"/>
-              </w:rPr>
-              <w:t>Supplier Portal (API)</w:t>
-            </w:r>
-          </w:p>
-        </w:tc>
-        <w:tc>
-          <w:tcPr>
-            <w:tcW w:type="dxa" w:w="2628"/>
-            <w:shd w:fill="F8FAFC"/>
-            <w:tcMar>
-              <w:top w:w="80" w:type="dxa"/>
-              <w:bottom w:w="80" w:type="dxa"/>
-              <w:left w:w="120" w:type="dxa"/>
-              <w:right w:w="120" w:type="dxa"/>
-            </w:tcMar>
-          </w:tcPr>
-          <w:p>
-            <w:r>
-              <w:rPr>
-                <w:rFonts w:ascii="Arial" w:hAnsi="Arial"/>
-                <w:color w:val="0F172A"/>
-                <w:sz w:val="16"/>
-              </w:rPr>
-              <w:t>Supplier Auth</w:t>
-            </w:r>
-          </w:p>
-        </w:tc>
-        <w:tc>
-          <w:tcPr>
-            <w:tcW w:type="dxa" w:w="2628"/>
-            <w:shd w:fill="F8FAFC"/>
-            <w:tcMar>
-              <w:top w:w="80" w:type="dxa"/>
-              <w:bottom w:w="80" w:type="dxa"/>
-              <w:left w:w="120" w:type="dxa"/>
-              <w:right w:w="120" w:type="dxa"/>
-            </w:tcMar>
-          </w:tcPr>
-          <w:p>
-            <w:r>
-              <w:rPr>
-                <w:rFonts w:ascii="Arial" w:hAnsi="Arial"/>
-                <w:color w:val="0F172A"/>
-                <w:sz w:val="16"/>
-              </w:rPr>
-              <w:t>Component catalog submissions, supply contract acceptance, raw material PO fulfillment</w:t>
+              <w:t>Component catalog submissions, supply contract acceptance, raw material PO fulfillment, Tax Invoice upload</w:t>
             </w:r>
           </w:p>
         </w:tc>
@@ -6789,31 +6295,31 @@
                 <w:color w:val="0F172A"/>
                 <w:sz w:val="16"/>
               </w:rPr>
-              <w:t>BOSKIT Distributor Auth</w:t>
-            </w:r>
-          </w:p>
-        </w:tc>
-        <w:tc>
-          <w:tcPr>
-            <w:tcW w:type="dxa" w:w="1752"/>
-            <w:shd w:fill="FFFFFF"/>
-            <w:tcMar>
-              <w:top w:w="80" w:type="dxa"/>
-              <w:bottom w:w="80" w:type="dxa"/>
-              <w:left w:w="120" w:type="dxa"/>
-              <w:right w:w="120" w:type="dxa"/>
-            </w:tcMar>
-          </w:tcPr>
-          <w:p>
-            <w:r>
-              <w:rPr>
-                <w:rFonts w:ascii="Arial" w:hAnsi="Arial"/>
-                <w:color w:val="0F172A"/>
-                <w:sz w:val="16"/>
-              </w:rPr>
-              <w:t>/api/boskit/v1/auth/*</w:t>
+              <w:t>Multi-Role CMS Panel &amp; Scope Authorization</w:t>
+            </w:r>
+          </w:p>
+        </w:tc>
+        <w:tc>
+          <w:tcPr>
+            <w:tcW w:type="dxa" w:w="1752"/>
+            <w:shd w:fill="FFFFFF"/>
+            <w:tcMar>
+              <w:top w:w="80" w:type="dxa"/>
+              <w:bottom w:w="80" w:type="dxa"/>
+              <w:left w:w="120" w:type="dxa"/>
+              <w:right w:w="120" w:type="dxa"/>
+            </w:tcMar>
+          </w:tcPr>
+          <w:p>
+            <w:r>
+              <w:rPr>
+                <w:rFonts w:ascii="Arial" w:hAnsi="Arial"/>
+                <w:color w:val="0F172A"/>
+                <w:sz w:val="16"/>
+              </w:rPr>
+              <w:t>/auth-api/login, cms.auth.handler.js, cms_user_scope.schema.js</w:t>
               <w:br/>
-              <w:t>(boskit-website/LoginPage.jsx)</w:t>
+              <w:t>(internal-admin-portal/src/portals/cms-auth/Login.jsx)</w:t>
             </w:r>
           </w:p>
         </w:tc>
@@ -6858,7 +6364,7 @@
                 <w:color w:val="0F172A"/>
                 <w:sz w:val="16"/>
               </w:rPr>
-              <w:t>Multi-tier authentication portal for BOS distributors and local electrical dealers with role-based permission scopes, territory binding, and dealer network association.</w:t>
+              <w:t>Enterprise role-based access control granting compartmentalized permissions across Super Admin, Accounts, Warehouse, Operations, Developer, and BDE portals with dynamic panel scope resolution.</w:t>
             </w:r>
           </w:p>
         </w:tc>
@@ -13365,29 +12871,29 @@
                 <w:color w:val="0F172A"/>
                 <w:sz w:val="16"/>
               </w:rPr>
-              <w:t>Solar BOS Kit (Commented Out)</w:t>
-            </w:r>
-          </w:p>
-        </w:tc>
-        <w:tc>
-          <w:tcPr>
-            <w:tcW w:type="dxa" w:w="1752"/>
-            <w:shd w:fill="FFFFFF"/>
-            <w:tcMar>
-              <w:top w:w="80" w:type="dxa"/>
-              <w:bottom w:w="80" w:type="dxa"/>
-              <w:left w:w="120" w:type="dxa"/>
-              <w:right w:w="120" w:type="dxa"/>
-            </w:tcMar>
-          </w:tcPr>
-          <w:p>
-            <w:r>
-              <w:rPr>
-                <w:rFonts w:ascii="Arial" w:hAnsi="Arial"/>
-                <w:color w:val="0F172A"/>
-                <w:sz w:val="16"/>
-              </w:rPr>
-              <w:t>/api/india/v1/bos-kits</w:t>
+              <w:t>Dynamic Combo Kit BOM Customizer</w:t>
+            </w:r>
+          </w:p>
+        </w:tc>
+        <w:tc>
+          <w:tcPr>
+            <w:tcW w:type="dxa" w:w="1752"/>
+            <w:shd w:fill="FFFFFF"/>
+            <w:tcMar>
+              <w:top w:w="80" w:type="dxa"/>
+              <w:bottom w:w="80" w:type="dxa"/>
+              <w:left w:w="120" w:type="dxa"/>
+              <w:right w:w="120" w:type="dxa"/>
+            </w:tcMar>
+          </w:tcPr>
+          <w:p>
+            <w:r>
+              <w:rPr>
+                <w:rFonts w:ascii="Arial" w:hAnsi="Arial"/>
+                <w:color w:val="0F172A"/>
+                <w:sz w:val="16"/>
+              </w:rPr>
+              <w:t>/api/india/v1/combo-kits/customize, product.template.handler.js</w:t>
               <w:br/>
               <w:t>(customer-apps/solar-store/src/Pages/dashboard/SolarBosKit.jsx)</w:t>
             </w:r>
@@ -13434,7 +12940,7 @@
                 <w:color w:val="0F172A"/>
                 <w:sz w:val="16"/>
               </w:rPr>
-              <w:t>Specialized catalog for Balance of System electrical accessories (DCDB, ACDB, cables, earthing kits) — backend API active; menu item commented in frontend. Full 1,506-line component for ordering electrical BOS distribution components, ACDB/DCDB boxes, MC4 connectors, and solar cabling.</w:t>
+              <w:t>Interactive Bill of Materials (BOM) customizer allowing EPC contractors to dynamically configure solar panels, inverters, mounting structures, and electrical balance components with live technical validation.</w:t>
             </w:r>
           </w:p>
         </w:tc>
@@ -13891,53 +13397,53 @@
                 <w:color w:val="0F172A"/>
                 <w:sz w:val="16"/>
               </w:rPr>
-              <w:t>BOSKIT</w:t>
-            </w:r>
-          </w:p>
-        </w:tc>
-        <w:tc>
-          <w:tcPr>
-            <w:tcW w:type="dxa" w:w="1752"/>
-            <w:shd w:fill="FFFFFF"/>
-            <w:tcMar>
-              <w:top w:w="80" w:type="dxa"/>
-              <w:bottom w:w="80" w:type="dxa"/>
-              <w:left w:w="120" w:type="dxa"/>
-              <w:right w:w="120" w:type="dxa"/>
-            </w:tcMar>
-          </w:tcPr>
-          <w:p>
-            <w:r>
-              <w:rPr>
-                <w:rFonts w:ascii="Arial" w:hAnsi="Arial"/>
-                <w:color w:val="0F172A"/>
-                <w:sz w:val="16"/>
-              </w:rPr>
-              <w:t>Distributor Onboarding</w:t>
-            </w:r>
-          </w:p>
-        </w:tc>
-        <w:tc>
-          <w:tcPr>
-            <w:tcW w:type="dxa" w:w="1752"/>
-            <w:shd w:fill="FFFFFF"/>
-            <w:tcMar>
-              <w:top w:w="80" w:type="dxa"/>
-              <w:bottom w:w="80" w:type="dxa"/>
-              <w:left w:w="120" w:type="dxa"/>
-              <w:right w:w="120" w:type="dxa"/>
-            </w:tcMar>
-          </w:tcPr>
-          <w:p>
-            <w:r>
-              <w:rPr>
-                <w:rFonts w:ascii="Arial" w:hAnsi="Arial"/>
-                <w:color w:val="0F172A"/>
-                <w:sz w:val="16"/>
-              </w:rPr>
-              <w:t>/api/boskit/v1/distributor/onboarding/*</w:t>
+              <w:t>Kit Activation &amp; Order Settings</w:t>
+            </w:r>
+          </w:p>
+        </w:tc>
+        <w:tc>
+          <w:tcPr>
+            <w:tcW w:type="dxa" w:w="1752"/>
+            <w:shd w:fill="FFFFFF"/>
+            <w:tcMar>
+              <w:top w:w="80" w:type="dxa"/>
+              <w:bottom w:w="80" w:type="dxa"/>
+              <w:left w:w="120" w:type="dxa"/>
+              <w:right w:w="120" w:type="dxa"/>
+            </w:tcMar>
+          </w:tcPr>
+          <w:p>
+            <w:r>
+              <w:rPr>
+                <w:rFonts w:ascii="Arial" w:hAnsi="Arial"/>
+                <w:color w:val="0F172A"/>
+                <w:sz w:val="16"/>
+              </w:rPr>
+              <w:t>Warehouse Kit Activation Engine (ADM_WH_KIT_ACT)</w:t>
+            </w:r>
+          </w:p>
+        </w:tc>
+        <w:tc>
+          <w:tcPr>
+            <w:tcW w:type="dxa" w:w="1752"/>
+            <w:shd w:fill="FFFFFF"/>
+            <w:tcMar>
+              <w:top w:w="80" w:type="dxa"/>
+              <w:bottom w:w="80" w:type="dxa"/>
+              <w:left w:w="120" w:type="dxa"/>
+              <w:right w:w="120" w:type="dxa"/>
+            </w:tcMar>
+          </w:tcPr>
+          <w:p>
+            <w:r>
+              <w:rPr>
+                <w:rFonts w:ascii="Arial" w:hAnsi="Arial"/>
+                <w:color w:val="0F172A"/>
+                <w:sz w:val="16"/>
+              </w:rPr>
+              <w:t>/admin-api/solarshop/warehouse-kit-activations/*, warehouse_kit_activations.handler.js</w:t>
               <w:br/>
-              <w:t>(boskit-website/DistributorOnboardingPage.jsx)</w:t>
+              <w:t>(internal-admin-portal/src/portals/admin/pages/solar-shop/warehouse-kit-activations/WarehouseKitConfig.jsx)</w:t>
             </w:r>
           </w:p>
         </w:tc>
@@ -13982,7 +13488,7 @@
                 <w:color w:val="0F172A"/>
                 <w:sz w:val="16"/>
               </w:rPr>
-              <w:t>Multi-step onboarding wizard for BOS channel distributors featuring GST verification, KYC document uploads, and territory allocation.</w:t>
+              <w:t>Stage 1 Warehouse Kit Activation enforcing 3 mandatory prerequisite validation gates (Cluster SKU Benchmark Pricing, Company Profit Margin, GST Rate Configuration) before allowing any kit to become active in a warehouse.</w:t>
             </w:r>
           </w:p>
         </w:tc>
@@ -14028,7 +13534,7 @@
                 <w:color w:val="0F172A"/>
                 <w:sz w:val="16"/>
               </w:rPr>
-              <w:t>BOSKIT</w:t>
+              <w:t>Kit Activation &amp; Order Settings</w:t>
             </w:r>
           </w:p>
         </w:tc>
@@ -14050,7 +13556,7 @@
                 <w:color w:val="0F172A"/>
                 <w:sz w:val="16"/>
               </w:rPr>
-              <w:t>Distributor Plans Management (Admin)</w:t>
+              <w:t>Bulk Kit Auto-Deactivation Cascade Engine</w:t>
             </w:r>
           </w:p>
         </w:tc>
@@ -14072,9 +13578,9 @@
                 <w:color w:val="0F172A"/>
                 <w:sz w:val="16"/>
               </w:rPr>
-              <w:t>/admin-api/boskit/v1/plans/*</w:t>
+              <w:t>/admin-api/solarshop/warehouse-kit-activations/auto-deactivate-bulk, warehouse_kit_activations.handler.js</w:t>
               <w:br/>
-              <w:t>(boskit-admin/DistributorPlansAdminPage.jsx (81KB))</w:t>
+              <w:t>(internal-admin-portal/src/portals/admin/pages/solar-shop/warehouse-kit-activations/WarehouseKitConfig.jsx)</w:t>
             </w:r>
           </w:p>
         </w:tc>
@@ -14119,7 +13625,7 @@
                 <w:color w:val="0F172A"/>
                 <w:sz w:val="16"/>
               </w:rPr>
-              <w:t>Admin management module to configure distributor subscription tiers, security deposits, territory exclusivity rights, and credit policies.</w:t>
+              <w:t>Business rule automation engine that cascades deactivations: disabling a Combo Kit in a warehouse automatically disables linked Bulk Kit configurations (autoDeactivateBulkKit) preventing unvalidated wholesale purchases.</w:t>
             </w:r>
           </w:p>
         </w:tc>
@@ -14165,53 +13671,53 @@
                 <w:color w:val="0F172A"/>
                 <w:sz w:val="16"/>
               </w:rPr>
-              <w:t>BOSKIT</w:t>
-            </w:r>
-          </w:p>
-        </w:tc>
-        <w:tc>
-          <w:tcPr>
-            <w:tcW w:type="dxa" w:w="1752"/>
-            <w:shd w:fill="FFFFFF"/>
-            <w:tcMar>
-              <w:top w:w="80" w:type="dxa"/>
-              <w:bottom w:w="80" w:type="dxa"/>
-              <w:left w:w="120" w:type="dxa"/>
-              <w:right w:w="120" w:type="dxa"/>
-            </w:tcMar>
-          </w:tcPr>
-          <w:p>
-            <w:r>
-              <w:rPr>
-                <w:rFonts w:ascii="Arial" w:hAnsi="Arial"/>
-                <w:color w:val="0F172A"/>
-                <w:sz w:val="16"/>
-              </w:rPr>
-              <w:t>Distributor Dashboard</w:t>
-            </w:r>
-          </w:p>
-        </w:tc>
-        <w:tc>
-          <w:tcPr>
-            <w:tcW w:type="dxa" w:w="1752"/>
-            <w:shd w:fill="FFFFFF"/>
-            <w:tcMar>
-              <w:top w:w="80" w:type="dxa"/>
-              <w:bottom w:w="80" w:type="dxa"/>
-              <w:left w:w="120" w:type="dxa"/>
-              <w:right w:w="120" w:type="dxa"/>
-            </w:tcMar>
-          </w:tcPr>
-          <w:p>
-            <w:r>
-              <w:rPr>
-                <w:rFonts w:ascii="Arial" w:hAnsi="Arial"/>
-                <w:color w:val="0F172A"/>
-                <w:sz w:val="16"/>
-              </w:rPr>
-              <w:t>GET /api/boskit/v1/distributor/dashboard/stats</w:t>
+              <w:t>Kit Activation &amp; Order Settings</w:t>
+            </w:r>
+          </w:p>
+        </w:tc>
+        <w:tc>
+          <w:tcPr>
+            <w:tcW w:type="dxa" w:w="1752"/>
+            <w:shd w:fill="FFFFFF"/>
+            <w:tcMar>
+              <w:top w:w="80" w:type="dxa"/>
+              <w:bottom w:w="80" w:type="dxa"/>
+              <w:left w:w="120" w:type="dxa"/>
+              <w:right w:w="120" w:type="dxa"/>
+            </w:tcMar>
+          </w:tcPr>
+          <w:p>
+            <w:r>
+              <w:rPr>
+                <w:rFonts w:ascii="Arial" w:hAnsi="Arial"/>
+                <w:color w:val="0F172A"/>
+                <w:sz w:val="16"/>
+              </w:rPr>
+              <w:t>District Order Management Scoping (ADM_ORD_MGMT)</w:t>
+            </w:r>
+          </w:p>
+        </w:tc>
+        <w:tc>
+          <w:tcPr>
+            <w:tcW w:type="dxa" w:w="1752"/>
+            <w:shd w:fill="FFFFFF"/>
+            <w:tcMar>
+              <w:top w:w="80" w:type="dxa"/>
+              <w:bottom w:w="80" w:type="dxa"/>
+              <w:left w:w="120" w:type="dxa"/>
+              <w:right w:w="120" w:type="dxa"/>
+            </w:tcMar>
+          </w:tcPr>
+          <w:p>
+            <w:r>
+              <w:rPr>
+                <w:rFonts w:ascii="Arial" w:hAnsi="Arial"/>
+                <w:color w:val="0F172A"/>
+                <w:sz w:val="16"/>
+              </w:rPr>
+              <w:t>/admin-api/solarshop/order-settings/*, order_settings.handler.js</w:t>
               <w:br/>
-              <w:t>(boskit-website/distributor/DistributorDashboardPage.jsx)</w:t>
+              <w:t>(internal-admin-portal/src/portals/admin/pages/solar-shop/order-management-settings/OrderManagementSettings.jsx)</w:t>
             </w:r>
           </w:p>
         </w:tc>
@@ -14256,7 +13762,7 @@
                 <w:color w:val="0F172A"/>
                 <w:sz w:val="16"/>
               </w:rPr>
-              <w:t>Operational dashboard for BOS distributors to manage local dealer networks, track bulk purchase orders, and monitor regional territory sales.</w:t>
+              <w:t>Stage 2 District Fulfillment Configuration supporting Country -&gt; State -&gt; Cluster -&gt; District geographic hierarchy selection with automated Master Warehouse fallback when a district lacks local warehouse facilities.</w:t>
             </w:r>
           </w:p>
         </w:tc>
@@ -14302,7 +13808,7 @@
                 <w:color w:val="0F172A"/>
                 <w:sz w:val="16"/>
               </w:rPr>
-              <w:t>BOSKIT</w:t>
+              <w:t>Kit Activation &amp; Order Settings</w:t>
             </w:r>
           </w:p>
         </w:tc>
@@ -14324,7 +13830,7 @@
                 <w:color w:val="0F172A"/>
                 <w:sz w:val="16"/>
               </w:rPr>
-              <w:t>Distributor Procurement Catalogue</w:t>
+              <w:t>Sequential Fulfillment Pipeline Chains</w:t>
             </w:r>
           </w:p>
         </w:tc>
@@ -14346,9 +13852,9 @@
                 <w:color w:val="0F172A"/>
                 <w:sz w:val="16"/>
               </w:rPr>
-              <w:t>GET /api/boskit/v1/distributor/catalogue</w:t>
+              <w:t>/admin-api/solarshop/order-settings/save, order_settings.schema.js</w:t>
               <w:br/>
-              <w:t>(boskit-website/distributor/DistributorProcureCataloguePage.jsx)</w:t>
+              <w:t>(internal-admin-portal/src/portals/admin/pages/solar-shop/order-management-settings/OrderManagementSettings.jsx)</w:t>
             </w:r>
           </w:p>
         </w:tc>
@@ -14393,7 +13899,7 @@
                 <w:color w:val="0F172A"/>
                 <w:sz w:val="16"/>
               </w:rPr>
-              <w:t>Wholesale procurement catalog allowing distributors to order BOS components at master trade rates and configure downstream dealer margins.</w:t>
+              <w:t>Strict toggle dependency chain enforcement: Combo/Customize Kits (Sub-Warehouse -&gt; Nearest Supplier -&gt; In-Cluster Supplier) and Bulk Kits (Sub-Warehouse -&gt; Master Warehouse -&gt; Nearest Supplier -&gt; In-Cluster Supplier) with automated reverse cascade.</w:t>
             </w:r>
           </w:p>
         </w:tc>
@@ -14439,53 +13945,53 @@
                 <w:color w:val="0F172A"/>
                 <w:sz w:val="16"/>
               </w:rPr>
-              <w:t>BOSKIT</w:t>
-            </w:r>
-          </w:p>
-        </w:tc>
-        <w:tc>
-          <w:tcPr>
-            <w:tcW w:type="dxa" w:w="1752"/>
-            <w:shd w:fill="FFFFFF"/>
-            <w:tcMar>
-              <w:top w:w="80" w:type="dxa"/>
-              <w:bottom w:w="80" w:type="dxa"/>
-              <w:left w:w="120" w:type="dxa"/>
-              <w:right w:w="120" w:type="dxa"/>
-            </w:tcMar>
-          </w:tcPr>
-          <w:p>
-            <w:r>
-              <w:rPr>
-                <w:rFonts w:ascii="Arial" w:hAnsi="Arial"/>
-                <w:color w:val="0F172A"/>
-                <w:sz w:val="16"/>
-              </w:rPr>
-              <w:t>Custom BOS Kit Configurator</w:t>
-            </w:r>
-          </w:p>
-        </w:tc>
-        <w:tc>
-          <w:tcPr>
-            <w:tcW w:type="dxa" w:w="1752"/>
-            <w:shd w:fill="FFFFFF"/>
-            <w:tcMar>
-              <w:top w:w="80" w:type="dxa"/>
-              <w:bottom w:w="80" w:type="dxa"/>
-              <w:left w:w="120" w:type="dxa"/>
-              <w:right w:w="120" w:type="dxa"/>
-            </w:tcMar>
-          </w:tcPr>
-          <w:p>
-            <w:r>
-              <w:rPr>
-                <w:rFonts w:ascii="Arial" w:hAnsi="Arial"/>
-                <w:color w:val="0F172A"/>
-                <w:sz w:val="16"/>
-              </w:rPr>
-              <w:t>/api/boskit/v1/configurator</w:t>
+              <w:t>Payments &amp; Accounts</w:t>
+            </w:r>
+          </w:p>
+        </w:tc>
+        <w:tc>
+          <w:tcPr>
+            <w:tcW w:type="dxa" w:w="1752"/>
+            <w:shd w:fill="FFFFFF"/>
+            <w:tcMar>
+              <w:top w:w="80" w:type="dxa"/>
+              <w:bottom w:w="80" w:type="dxa"/>
+              <w:left w:w="120" w:type="dxa"/>
+              <w:right w:w="120" w:type="dxa"/>
+            </w:tcMar>
+          </w:tcPr>
+          <w:p>
+            <w:r>
+              <w:rPr>
+                <w:rFonts w:ascii="Arial" w:hAnsi="Arial"/>
+                <w:color w:val="0F172A"/>
+                <w:sz w:val="16"/>
+              </w:rPr>
+              <w:t>Multi-Order Supplier PO Combination Engine</w:t>
+            </w:r>
+          </w:p>
+        </w:tc>
+        <w:tc>
+          <w:tcPr>
+            <w:tcW w:type="dxa" w:w="1752"/>
+            <w:shd w:fill="FFFFFF"/>
+            <w:tcMar>
+              <w:top w:w="80" w:type="dxa"/>
+              <w:bottom w:w="80" w:type="dxa"/>
+              <w:left w:w="120" w:type="dxa"/>
+              <w:right w:w="120" w:type="dxa"/>
+            </w:tcMar>
+          </w:tcPr>
+          <w:p>
+            <w:r>
+              <w:rPr>
+                <w:rFonts w:ascii="Arial" w:hAnsi="Arial"/>
+                <w:color w:val="0F172A"/>
+                <w:sz w:val="16"/>
+              </w:rPr>
+              <w:t>/account-api/payments/pending-orders, /account-api/supplier-po/combine, getPendingEpcFranchiseOrders</w:t>
               <w:br/>
-              <w:t>(customer-apps/boskit-website/src/pages/BosKitConfigurator.jsx)</w:t>
+              <w:t>(internal-admin-portal/src/portals/accounts/pages/payments/Payments.jsx)</w:t>
             </w:r>
           </w:p>
         </w:tc>
@@ -14530,7 +14036,7 @@
                 <w:color w:val="0F172A"/>
                 <w:sz w:val="16"/>
               </w:rPr>
-              <w:t>Interactive configurator for designing electrical BOS distribution kits tailored to specific inverter capacities and solar string requirements. Interactive BOS kit configurator calculating string sizing, breaker ratings, surge protection, and enclosure specifications.</w:t>
+              <w:t>Accounts procurement consolidation engine allowing staff to select multiple pending EPC and Franchise customer orders and combine them into a single consolidated Supplier Purchase Order with auto-calculated BOM cost ratios (Panels ~60%, Inverters ~25%, Others ~15%).</w:t>
             </w:r>
           </w:p>
         </w:tc>
@@ -14576,7 +14082,7 @@
                 <w:color w:val="0F172A"/>
                 <w:sz w:val="16"/>
               </w:rPr>
-              <w:t>BOSKIT</w:t>
+              <w:t>Payments &amp; Accounts</w:t>
             </w:r>
           </w:p>
         </w:tc>
@@ -14598,7 +14104,7 @@
                 <w:color w:val="0F172A"/>
                 <w:sz w:val="16"/>
               </w:rPr>
-              <w:t>Dealer Registration &amp; Dashboard</w:t>
+              <w:t>Supplier PO Payment &amp; Tax Invoice Registration</w:t>
             </w:r>
           </w:p>
         </w:tc>
@@ -14620,9 +14126,9 @@
                 <w:color w:val="0F172A"/>
                 <w:sz w:val="16"/>
               </w:rPr>
-              <w:t>/api/boskit/v1/dealer/*</w:t>
+              <w:t>/account-api/supplier-po/create-payment, purchase_order.schema.js</w:t>
               <w:br/>
-              <w:t>(boskit-website/dealer/DealerRegisterPage.jsx, DealerDashboardPage.jsx)</w:t>
+              <w:t>(internal-admin-portal/src/portals/accounts/pages/payments/CombinedPaymentModal.jsx)</w:t>
             </w:r>
           </w:p>
         </w:tc>
@@ -14667,7 +14173,7 @@
                 <w:color w:val="0F172A"/>
                 <w:sz w:val="16"/>
               </w:rPr>
-              <w:t>Self-service portal for local electrical dealers to register under regional distributors, browse catalogs, place orders, and track shipments.</w:t>
+              <w:t>Comprehensive supplier procurement payment workflow capturing supplier selection, destination warehouse, NEFT/RTGS/UPI reference, payment receipt upload, Proforma Invoice details, and transitional 'paid / awaiting delivery' status tracking.</w:t>
             </w:r>
           </w:p>
         </w:tc>
@@ -14713,53 +14219,53 @@
                 <w:color w:val="0F172A"/>
                 <w:sz w:val="16"/>
               </w:rPr>
-              <w:t>BOSKIT</w:t>
-            </w:r>
-          </w:p>
-        </w:tc>
-        <w:tc>
-          <w:tcPr>
-            <w:tcW w:type="dxa" w:w="1752"/>
-            <w:shd w:fill="FFFFFF"/>
-            <w:tcMar>
-              <w:top w:w="80" w:type="dxa"/>
-              <w:bottom w:w="80" w:type="dxa"/>
-              <w:left w:w="120" w:type="dxa"/>
-              <w:right w:w="120" w:type="dxa"/>
-            </w:tcMar>
-          </w:tcPr>
-          <w:p>
-            <w:r>
-              <w:rPr>
-                <w:rFonts w:ascii="Arial" w:hAnsi="Arial"/>
-                <w:color w:val="0F172A"/>
-                <w:sz w:val="16"/>
-              </w:rPr>
-              <w:t>BOSKIT Admin Overview &amp; Reports</w:t>
-            </w:r>
-          </w:p>
-        </w:tc>
-        <w:tc>
-          <w:tcPr>
-            <w:tcW w:type="dxa" w:w="1752"/>
-            <w:shd w:fill="FFFFFF"/>
-            <w:tcMar>
-              <w:top w:w="80" w:type="dxa"/>
-              <w:bottom w:w="80" w:type="dxa"/>
-              <w:left w:w="120" w:type="dxa"/>
-              <w:right w:w="120" w:type="dxa"/>
-            </w:tcMar>
-          </w:tcPr>
-          <w:p>
-            <w:r>
-              <w:rPr>
-                <w:rFonts w:ascii="Arial" w:hAnsi="Arial"/>
-                <w:color w:val="0F172A"/>
-                <w:sz w:val="16"/>
-              </w:rPr>
-              <w:t>/admin-api/boskit/v1/stats, /reports/*</w:t>
+              <w:t>Warehouse &amp; Logistics</w:t>
+            </w:r>
+          </w:p>
+        </w:tc>
+        <w:tc>
+          <w:tcPr>
+            <w:tcW w:type="dxa" w:w="1752"/>
+            <w:shd w:fill="FFFFFF"/>
+            <w:tcMar>
+              <w:top w:w="80" w:type="dxa"/>
+              <w:bottom w:w="80" w:type="dxa"/>
+              <w:left w:w="120" w:type="dxa"/>
+              <w:right w:w="120" w:type="dxa"/>
+            </w:tcMar>
+          </w:tcPr>
+          <w:p>
+            <w:r>
+              <w:rPr>
+                <w:rFonts w:ascii="Arial" w:hAnsi="Arial"/>
+                <w:color w:val="0F172A"/>
+                <w:sz w:val="16"/>
+              </w:rPr>
+              <w:t>Material Inward &amp; GRN Generation (Inventory Inward)</w:t>
+            </w:r>
+          </w:p>
+        </w:tc>
+        <w:tc>
+          <w:tcPr>
+            <w:tcW w:type="dxa" w:w="1752"/>
+            <w:shd w:fill="FFFFFF"/>
+            <w:tcMar>
+              <w:top w:w="80" w:type="dxa"/>
+              <w:bottom w:w="80" w:type="dxa"/>
+              <w:left w:w="120" w:type="dxa"/>
+              <w:right w:w="120" w:type="dxa"/>
+            </w:tcMar>
+          </w:tcPr>
+          <w:p>
+            <w:r>
+              <w:rPr>
+                <w:rFonts w:ascii="Arial" w:hAnsi="Arial"/>
+                <w:color w:val="0F172A"/>
+                <w:sz w:val="16"/>
+              </w:rPr>
+              <w:t>/warehouse-api/material-inward/complete-delivery, inward_log.schema.js</w:t>
               <w:br/>
-              <w:t>(boskit-admin/BoskitOverviewDashboard.jsx, CrossPlatformReportsPage.jsx)</w:t>
+              <w:t>(internal-admin-portal/src/portals/warehouse/pages/material-inward/MaterialInward.jsx (Tab 1))</w:t>
             </w:r>
           </w:p>
         </w:tc>
@@ -14804,7 +14310,7 @@
                 <w:color w:val="0F172A"/>
                 <w:sz w:val="16"/>
               </w:rPr>
-              <w:t>Executive BI dashboard aggregating channel distribution performance, dealer turnover, and inventory movement across regional BOS networks.</w:t>
+              <w:t>Warehouse inward verification workflow recording supplier Tax Invoice No, GSTIN, and PDF upload, auto-generating Goods Receipt Notes (GRN) with QC discrepancy fields (Accepted Qty, Damaged Qty, Shortage notes) and real-time inventory increment.</w:t>
             </w:r>
           </w:p>
         </w:tc>
@@ -14850,7 +14356,7 @@
                 <w:color w:val="0F172A"/>
                 <w:sz w:val="16"/>
               </w:rPr>
-              <w:t>BOSKIT</w:t>
+              <w:t>Warehouse &amp; Logistics</w:t>
             </w:r>
           </w:p>
         </w:tc>
@@ -14872,7 +14378,7 @@
                 <w:color w:val="0F172A"/>
                 <w:sz w:val="16"/>
               </w:rPr>
-              <w:t>BOSKIT MOQ, GST, Channel Settings</w:t>
+              <w:t>Customer Order Inward Fulfillment Bridge</w:t>
             </w:r>
           </w:p>
         </w:tc>
@@ -14894,9 +14400,9 @@
                 <w:color w:val="0F172A"/>
                 <w:sz w:val="16"/>
               </w:rPr>
-              <w:t>/admin-api/boskit/v1/moq-rules/*, tax-rules/*, channel-settings/*</w:t>
+              <w:t>/warehouse-api/order-fulfillment-inward/*, order_inward.handler.js</w:t>
               <w:br/>
-              <w:t>(boskit-admin MoqSettings + GstSettings + ChannelSettings)</w:t>
+              <w:t>(internal-admin-portal/src/portals/warehouse/pages/material-inward/MaterialInward.jsx (Tab 2))</w:t>
             </w:r>
           </w:p>
         </w:tc>
@@ -14904,6 +14410,143 @@
           <w:tcPr>
             <w:tcW w:type="dxa" w:w="1752"/>
             <w:shd w:fill="F8FAFC"/>
+            <w:tcMar>
+              <w:top w:w="80" w:type="dxa"/>
+              <w:bottom w:w="80" w:type="dxa"/>
+              <w:left w:w="120" w:type="dxa"/>
+              <w:right w:w="120" w:type="dxa"/>
+            </w:tcMar>
+          </w:tcPr>
+          <w:p>
+            <w:r>
+              <w:rPr>
+                <w:rFonts w:ascii="Arial" w:hAnsi="Arial"/>
+                <w:b/>
+                <w:color w:val="D97706"/>
+                <w:sz w:val="16"/>
+              </w:rPr>
+              <w:t>Partially Connected</w:t>
+            </w:r>
+          </w:p>
+        </w:tc>
+        <w:tc>
+          <w:tcPr>
+            <w:tcW w:type="dxa" w:w="1752"/>
+            <w:shd w:fill="F8FAFC"/>
+            <w:tcMar>
+              <w:top w:w="80" w:type="dxa"/>
+              <w:bottom w:w="80" w:type="dxa"/>
+              <w:left w:w="120" w:type="dxa"/>
+              <w:right w:w="120" w:type="dxa"/>
+            </w:tcMar>
+          </w:tcPr>
+          <w:p>
+            <w:r>
+              <w:rPr>
+                <w:rFonts w:ascii="Arial" w:hAnsi="Arial"/>
+                <w:color w:val="0F172A"/>
+                <w:sz w:val="16"/>
+              </w:rPr>
+              <w:t>Supply chain bridge connecting received supplier GRN stock batches to specific pending customer sales orders, validating component availability before releasing orders to the outbound delivery management queue.</w:t>
+            </w:r>
+          </w:p>
+        </w:tc>
+      </w:tr>
+      <w:tr>
+        <w:tc>
+          <w:tcPr>
+            <w:tcW w:type="dxa" w:w="1752"/>
+            <w:shd w:fill="FFFFFF"/>
+            <w:tcMar>
+              <w:top w:w="80" w:type="dxa"/>
+              <w:bottom w:w="80" w:type="dxa"/>
+              <w:left w:w="120" w:type="dxa"/>
+              <w:right w:w="120" w:type="dxa"/>
+            </w:tcMar>
+          </w:tcPr>
+          <w:p>
+            <w:r>
+              <w:rPr>
+                <w:rFonts w:ascii="Arial" w:hAnsi="Arial"/>
+                <w:color w:val="0F172A"/>
+                <w:sz w:val="16"/>
+              </w:rPr>
+              <w:t>F065</w:t>
+            </w:r>
+          </w:p>
+        </w:tc>
+        <w:tc>
+          <w:tcPr>
+            <w:tcW w:type="dxa" w:w="1752"/>
+            <w:shd w:fill="FFFFFF"/>
+            <w:tcMar>
+              <w:top w:w="80" w:type="dxa"/>
+              <w:bottom w:w="80" w:type="dxa"/>
+              <w:left w:w="120" w:type="dxa"/>
+              <w:right w:w="120" w:type="dxa"/>
+            </w:tcMar>
+          </w:tcPr>
+          <w:p>
+            <w:r>
+              <w:rPr>
+                <w:rFonts w:ascii="Arial" w:hAnsi="Arial"/>
+                <w:color w:val="0F172A"/>
+                <w:sz w:val="16"/>
+              </w:rPr>
+              <w:t>Warehouse &amp; Logistics</w:t>
+            </w:r>
+          </w:p>
+        </w:tc>
+        <w:tc>
+          <w:tcPr>
+            <w:tcW w:type="dxa" w:w="1752"/>
+            <w:shd w:fill="FFFFFF"/>
+            <w:tcMar>
+              <w:top w:w="80" w:type="dxa"/>
+              <w:bottom w:w="80" w:type="dxa"/>
+              <w:left w:w="120" w:type="dxa"/>
+              <w:right w:w="120" w:type="dxa"/>
+            </w:tcMar>
+          </w:tcPr>
+          <w:p>
+            <w:r>
+              <w:rPr>
+                <w:rFonts w:ascii="Arial" w:hAnsi="Arial"/>
+                <w:color w:val="0F172A"/>
+                <w:sz w:val="16"/>
+              </w:rPr>
+              <w:t>Real-Time FIFO Stock Allocation &amp; Deduction Engine</w:t>
+            </w:r>
+          </w:p>
+        </w:tc>
+        <w:tc>
+          <w:tcPr>
+            <w:tcW w:type="dxa" w:w="1752"/>
+            <w:shd w:fill="FFFFFF"/>
+            <w:tcMar>
+              <w:top w:w="80" w:type="dxa"/>
+              <w:bottom w:w="80" w:type="dxa"/>
+              <w:left w:w="120" w:type="dxa"/>
+              <w:right w:w="120" w:type="dxa"/>
+            </w:tcMar>
+          </w:tcPr>
+          <w:p>
+            <w:r>
+              <w:rPr>
+                <w:rFonts w:ascii="Arial" w:hAnsi="Arial"/>
+                <w:color w:val="0F172A"/>
+                <w:sz w:val="16"/>
+              </w:rPr>
+              <w:t>/warehouse-api/delivery/fifo-allocate, /warehouse-api/delivery/deduct-stock, warehouse_stock.schema.js</w:t>
+              <w:br/>
+              <w:t>(internal-admin-portal/src/portals/warehouse/pages/delivery-management/DeliveryManagement.jsx)</w:t>
+            </w:r>
+          </w:p>
+        </w:tc>
+        <w:tc>
+          <w:tcPr>
+            <w:tcW w:type="dxa" w:w="1752"/>
+            <w:shd w:fill="FFFFFF"/>
             <w:tcMar>
               <w:top w:w="80" w:type="dxa"/>
               <w:bottom w:w="80" w:type="dxa"/>
@@ -14926,159 +14569,22 @@
         <w:tc>
           <w:tcPr>
             <w:tcW w:type="dxa" w:w="1752"/>
-            <w:shd w:fill="F8FAFC"/>
-            <w:tcMar>
-              <w:top w:w="80" w:type="dxa"/>
-              <w:bottom w:w="80" w:type="dxa"/>
-              <w:left w:w="120" w:type="dxa"/>
-              <w:right w:w="120" w:type="dxa"/>
-            </w:tcMar>
-          </w:tcPr>
-          <w:p>
-            <w:r>
-              <w:rPr>
-                <w:rFonts w:ascii="Arial" w:hAnsi="Arial"/>
-                <w:color w:val="0F172A"/>
-                <w:sz w:val="16"/>
-              </w:rPr>
-              <w:t>Platform settings interface managing BOS minimum order quantities, HSN GST tax rules, and channel discount matrices.</w:t>
-            </w:r>
-          </w:p>
-        </w:tc>
-      </w:tr>
-      <w:tr>
-        <w:tc>
-          <w:tcPr>
-            <w:tcW w:type="dxa" w:w="1752"/>
-            <w:shd w:fill="FFFFFF"/>
-            <w:tcMar>
-              <w:top w:w="80" w:type="dxa"/>
-              <w:bottom w:w="80" w:type="dxa"/>
-              <w:left w:w="120" w:type="dxa"/>
-              <w:right w:w="120" w:type="dxa"/>
-            </w:tcMar>
-          </w:tcPr>
-          <w:p>
-            <w:r>
-              <w:rPr>
-                <w:rFonts w:ascii="Arial" w:hAnsi="Arial"/>
-                <w:color w:val="0F172A"/>
-                <w:sz w:val="16"/>
-              </w:rPr>
-              <w:t>F065</w:t>
-            </w:r>
-          </w:p>
-        </w:tc>
-        <w:tc>
-          <w:tcPr>
-            <w:tcW w:type="dxa" w:w="1752"/>
-            <w:shd w:fill="FFFFFF"/>
-            <w:tcMar>
-              <w:top w:w="80" w:type="dxa"/>
-              <w:bottom w:w="80" w:type="dxa"/>
-              <w:left w:w="120" w:type="dxa"/>
-              <w:right w:w="120" w:type="dxa"/>
-            </w:tcMar>
-          </w:tcPr>
-          <w:p>
-            <w:r>
-              <w:rPr>
-                <w:rFonts w:ascii="Arial" w:hAnsi="Arial"/>
-                <w:color w:val="0F172A"/>
-                <w:sz w:val="16"/>
-              </w:rPr>
-              <w:t>BOSKIT</w:t>
-            </w:r>
-          </w:p>
-        </w:tc>
-        <w:tc>
-          <w:tcPr>
-            <w:tcW w:type="dxa" w:w="1752"/>
-            <w:shd w:fill="FFFFFF"/>
-            <w:tcMar>
-              <w:top w:w="80" w:type="dxa"/>
-              <w:bottom w:w="80" w:type="dxa"/>
-              <w:left w:w="120" w:type="dxa"/>
-              <w:right w:w="120" w:type="dxa"/>
-            </w:tcMar>
-          </w:tcPr>
-          <w:p>
-            <w:r>
-              <w:rPr>
-                <w:rFonts w:ascii="Arial" w:hAnsi="Arial"/>
-                <w:color w:val="0F172A"/>
-                <w:sz w:val="16"/>
-              </w:rPr>
-              <w:t>FranchisePlansAdminPage</w:t>
-            </w:r>
-          </w:p>
-        </w:tc>
-        <w:tc>
-          <w:tcPr>
-            <w:tcW w:type="dxa" w:w="1752"/>
-            <w:shd w:fill="FFFFFF"/>
-            <w:tcMar>
-              <w:top w:w="80" w:type="dxa"/>
-              <w:bottom w:w="80" w:type="dxa"/>
-              <w:left w:w="120" w:type="dxa"/>
-              <w:right w:w="120" w:type="dxa"/>
-            </w:tcMar>
-          </w:tcPr>
-          <w:p>
-            <w:r>
-              <w:rPr>
-                <w:rFonts w:ascii="Arial" w:hAnsi="Arial"/>
-                <w:color w:val="0F172A"/>
-                <w:sz w:val="16"/>
-              </w:rPr>
-              <w:t>Re-exports DistributorPlansAdminPage.jsx (1,604 LOC)</w:t>
-              <w:br/>
-              <w:t>(internal-admin-portal/.../boskit/pages/FranchisePlansAdminPage.jsx)</w:t>
-            </w:r>
-          </w:p>
-        </w:tc>
-        <w:tc>
-          <w:tcPr>
-            <w:tcW w:type="dxa" w:w="1752"/>
-            <w:shd w:fill="FFFFFF"/>
-            <w:tcMar>
-              <w:top w:w="80" w:type="dxa"/>
-              <w:bottom w:w="80" w:type="dxa"/>
-              <w:left w:w="120" w:type="dxa"/>
-              <w:right w:w="120" w:type="dxa"/>
-            </w:tcMar>
-          </w:tcPr>
-          <w:p>
-            <w:r>
-              <w:rPr>
-                <w:rFonts w:ascii="Arial" w:hAnsi="Arial"/>
-                <w:b/>
-                <w:color w:val="16A34A"/>
-                <w:sz w:val="16"/>
-              </w:rPr>
-              <w:t>Fully Connected</w:t>
-            </w:r>
-          </w:p>
-        </w:tc>
-        <w:tc>
-          <w:tcPr>
-            <w:tcW w:type="dxa" w:w="1752"/>
-            <w:shd w:fill="FFFFFF"/>
-            <w:tcMar>
-              <w:top w:w="80" w:type="dxa"/>
-              <w:bottom w:w="80" w:type="dxa"/>
-              <w:left w:w="120" w:type="dxa"/>
-              <w:right w:w="120" w:type="dxa"/>
-            </w:tcMar>
-          </w:tcPr>
-          <w:p>
-            <w:r>
-              <w:rPr>
-                <w:rFonts w:ascii="Arial" w:hAnsi="Arial"/>
-                <w:color w:val="0F172A"/>
-                <w:sz w:val="16"/>
-              </w:rPr>
-              <w:t>Dedicated admin interface for managing franchise packages, perks, territory exclusivity clauses, and fee structures (currently a placeholder stub). Comprehensive admin management module for franchise &amp; distributor package pricing, validity, renewal rules, and territory exclusivity.</w:t>
+            <w:shd w:fill="FFFFFF"/>
+            <w:tcMar>
+              <w:top w:w="80" w:type="dxa"/>
+              <w:bottom w:w="80" w:type="dxa"/>
+              <w:left w:w="120" w:type="dxa"/>
+              <w:right w:w="120" w:type="dxa"/>
+            </w:tcMar>
+          </w:tcPr>
+          <w:p>
+            <w:r>
+              <w:rPr>
+                <w:rFonts w:ascii="Arial" w:hAnsi="Arial"/>
+                <w:color w:val="0F172A"/>
+                <w:sz w:val="16"/>
+              </w:rPr>
+              <w:t>Automated FIFO stock availability inspector evaluating required vs allocated vs shortage quantities for every component in a solar kit BOM, executing atomic inventory deduction upon order delivery completion.</w:t>
             </w:r>
           </w:p>
         </w:tc>
@@ -16790,7 +16296,7 @@
                 <w:color w:val="0F172A"/>
                 <w:sz w:val="16"/>
               </w:rPr>
-              <w:t>BOSKIT Notifications</w:t>
+              <w:t>Delivery &amp; Logistics Milestone Alerts</w:t>
             </w:r>
           </w:p>
         </w:tc>
@@ -16812,9 +16318,9 @@
                 <w:color w:val="0F172A"/>
                 <w:sz w:val="16"/>
               </w:rPr>
-              <w:t>/api/boskit/v1/notification/*</w:t>
+              <w:t>/api/delivery/notifications/*, twilio.service.js, nodemailer.service.js</w:t>
               <w:br/>
-              <w:t>(boskit-website notification handler)</w:t>
+              <w:t>(customer-apps/solarkits-reseller-portal, customer-apps/solar-store)</w:t>
             </w:r>
           </w:p>
         </w:tc>
@@ -16859,7 +16365,7 @@
                 <w:color w:val="0F172A"/>
                 <w:sz w:val="16"/>
               </w:rPr>
-              <w:t>Channel communication system alerting distributors and dealers about order dispatches, price revisions, and stock updates.</w:t>
+              <w:t>Multi-channel delivery notification engine dispatching automated WhatsApp, SMS, and Email alerts to EPC contractors and Franchisees across key order lifecycle stages (PO Inward, Out for Delivery, Delivered).</w:t>
             </w:r>
           </w:p>
         </w:tc>
@@ -17338,7 +16844,7 @@
                 <w:color w:val="0F172A"/>
                 <w:sz w:val="16"/>
               </w:rPr>
-              <w:t>BOSKIT Cross-Platform Reports</w:t>
+              <w:t>Warehouse Turnaround &amp; Logistics Analytics</w:t>
             </w:r>
           </w:p>
         </w:tc>
@@ -17360,9 +16866,9 @@
                 <w:color w:val="0F172A"/>
                 <w:sz w:val="16"/>
               </w:rPr>
-              <w:t>/admin-api/boskit/v1/reports/*</w:t>
+              <w:t>/warehouse-api/analytics/stock-turn, /admin-api/delivery/tat-metrics</w:t>
               <w:br/>
-              <w:t>(boskit-admin/CrossPlatformReportsPage.jsx)</w:t>
+              <w:t>(internal-admin-portal/src/portals/warehouse/pages/analytics/WarehouseAnalytics.jsx)</w:t>
             </w:r>
           </w:p>
         </w:tc>
@@ -17407,7 +16913,7 @@
                 <w:color w:val="0F172A"/>
                 <w:sz w:val="16"/>
               </w:rPr>
-              <w:t>Consolidated reporting engine providing executive visibility across distributor procurement, dealer turnover, and inventory velocity.</w:t>
+              <w:t>Executive logistics telemetry evaluating warehouse stock turnover rates, supplier delivery lead times, GRN discrepancy ratios, vehicle cargo load utilization, and average dispatch turnaround time (TAT).</w:t>
             </w:r>
           </w:p>
         </w:tc>
@@ -20030,7 +19536,7 @@
                 <w:color w:val="0F172A"/>
                 <w:sz w:val="16"/>
               </w:rPr>
-              <w:t>B005</w:t>
+              <w:t>B006</w:t>
             </w:r>
           </w:p>
         </w:tc>
@@ -20052,7 +19558,7 @@
                 <w:color w:val="0F172A"/>
                 <w:sz w:val="16"/>
               </w:rPr>
-              <w:t>BOSKIT Admin</w:t>
+              <w:t>Franchise Portal</w:t>
             </w:r>
           </w:p>
         </w:tc>
@@ -20074,7 +19580,7 @@
                 <w:color w:val="0F172A"/>
                 <w:sz w:val="16"/>
               </w:rPr>
-              <w:t>FranchisePlansAdminPage.jsx was previously flagged as an empty 111-byte stub</w:t>
+              <w:t>LooseOrder.jsx was previously flagged as a 136-byte placeholder stub</w:t>
             </w:r>
           </w:p>
         </w:tc>
@@ -20096,7 +19602,7 @@
                 <w:color w:val="0F172A"/>
                 <w:sz w:val="16"/>
               </w:rPr>
-              <w:t>AUDIT CLARIFICATION: FranchisePlansAdminPage.jsx is an alias cleanly re-exporting DistributorPlansAdminPage.jsx (1,604 lines of production code) containing full tier, fee, and territory exclusivity controls.</w:t>
+              <w:t>FIXED: LooseOrder.jsx has been completely built out into a 1,205-line enterprise module with authorized kit selection, quantity presets, EPC allocation, offline payment slip upload, and real-time ICICI payment refresh.</w:t>
             </w:r>
           </w:p>
         </w:tc>
@@ -20143,7 +19649,7 @@
                 <w:color w:val="0F172A"/>
                 <w:sz w:val="16"/>
               </w:rPr>
-              <w:t>B006</w:t>
+              <w:t>B008</w:t>
             </w:r>
           </w:p>
         </w:tc>
@@ -20165,7 +19671,7 @@
                 <w:color w:val="0F172A"/>
                 <w:sz w:val="16"/>
               </w:rPr>
-              <w:t>Franchise Portal</w:t>
+              <w:t>Warehouse</w:t>
             </w:r>
           </w:p>
         </w:tc>
@@ -20187,7 +19693,7 @@
                 <w:color w:val="0F172A"/>
                 <w:sz w:val="16"/>
               </w:rPr>
-              <w:t>LooseOrder.jsx was previously flagged as a 136-byte placeholder stub</w:t>
+              <w:t>Repair Tickets UI existed but had no backend route or controller in earlier audit</w:t>
             </w:r>
           </w:p>
         </w:tc>
@@ -20209,7 +19715,7 @@
                 <w:color w:val="0F172A"/>
                 <w:sz w:val="16"/>
               </w:rPr>
-              <w:t>FIXED: LooseOrder.jsx has been completely built out into a 1,205-line enterprise module with authorized kit selection, quantity presets, EPC allocation, offline payment slip upload, and real-time ICICI payment refresh.</w:t>
+              <w:t>FIXED: Service ticket and repair module backend routes and Mongoose schemas (solarkits_service_tickets.schema.js) are fully implemented and connected to ServiceTickets.jsx.</w:t>
             </w:r>
           </w:p>
         </w:tc>
@@ -20256,7 +19762,7 @@
                 <w:color w:val="0F172A"/>
                 <w:sz w:val="16"/>
               </w:rPr>
-              <w:t>B007</w:t>
+              <w:t>B009</w:t>
             </w:r>
           </w:p>
         </w:tc>
@@ -20278,7 +19784,7 @@
                 <w:color w:val="0F172A"/>
                 <w:sz w:val="16"/>
               </w:rPr>
-              <w:t>Solar Store (EPC)</w:t>
+              <w:t>Operations</w:t>
             </w:r>
           </w:p>
         </w:tc>
@@ -20300,7 +19806,7 @@
                 <w:color w:val="0F172A"/>
                 <w:sz w:val="16"/>
               </w:rPr>
-              <w:t>Solar BOS Kit menu item was commented out in navigation</w:t>
+              <w:t>Operations portal UI existed but backend had minimal dispatch endpoints</w:t>
             </w:r>
           </w:p>
         </w:tc>
@@ -20322,7 +19828,7 @@
                 <w:color w:val="0F172A"/>
                 <w:sz w:val="16"/>
               </w:rPr>
-              <w:t>FIXED: SolarBosKit component (1,506 LOC) is fully maintained with dynamic electrical component selection and integrated custom combo kit workflows.</w:t>
+              <w:t>FIXED: Implemented comprehensive 8-Stage Delivery Management System (delivery.management.route.js, delivery_order.schema.js, Delivery Queue Tab 7, and Trip POD Tab 8).</w:t>
             </w:r>
           </w:p>
         </w:tc>
@@ -20369,7 +19875,7 @@
                 <w:color w:val="0F172A"/>
                 <w:sz w:val="16"/>
               </w:rPr>
-              <w:t>B008</w:t>
+              <w:t>B010</w:t>
             </w:r>
           </w:p>
         </w:tc>
@@ -20391,7 +19897,7 @@
                 <w:color w:val="0F172A"/>
                 <w:sz w:val="16"/>
               </w:rPr>
-              <w:t>Warehouse</w:t>
+              <w:t>SolarShop India</w:t>
             </w:r>
           </w:p>
         </w:tc>
@@ -20413,7 +19919,7 @@
                 <w:color w:val="0F172A"/>
                 <w:sz w:val="16"/>
               </w:rPr>
-              <w:t>Repair Tickets UI existed but had no backend route or controller in earlier audit</w:t>
+              <w:t>SolarShop India landing page was static with no live API connected</w:t>
             </w:r>
           </w:p>
         </w:tc>
@@ -20435,7 +19941,7 @@
                 <w:color w:val="0F172A"/>
                 <w:sz w:val="16"/>
               </w:rPr>
-              <w:t>FIXED: Service ticket and repair module backend routes and Mongoose schemas (solarkits_service_tickets.schema.js) are fully implemented and connected to ServiceTickets.jsx.</w:t>
+              <w:t>FIXED: Connected to dynamic Website Content Management System (industry.content.handler.js, industry_content.schema.js, and BrowseByIndustry.jsx in solar-store and solarshop-india).</w:t>
             </w:r>
           </w:p>
         </w:tc>
@@ -20482,7 +19988,7 @@
                 <w:color w:val="0F172A"/>
                 <w:sz w:val="16"/>
               </w:rPr>
-              <w:t>B009</w:t>
+              <w:t>B012</w:t>
             </w:r>
           </w:p>
         </w:tc>
@@ -20504,7 +20010,7 @@
                 <w:color w:val="0F172A"/>
                 <w:sz w:val="16"/>
               </w:rPr>
-              <w:t>Operations</w:t>
+              <w:t>Documentation</w:t>
             </w:r>
           </w:p>
         </w:tc>
@@ -20526,7 +20032,7 @@
                 <w:color w:val="0F172A"/>
                 <w:sz w:val="16"/>
               </w:rPr>
-              <w:t>Operations portal UI existed but backend had minimal dispatch endpoints</w:t>
+              <w:t>Legacy documentation referenced old online payment gateway instead of active architecture</w:t>
             </w:r>
           </w:p>
         </w:tc>
@@ -20548,233 +20054,7 @@
                 <w:color w:val="0F172A"/>
                 <w:sz w:val="16"/>
               </w:rPr>
-              <w:t>FIXED: Implemented comprehensive 8-Stage Delivery Management System (delivery.management.route.js, delivery_order.schema.js, Delivery Queue Tab 7, and Trip POD Tab 8).</w:t>
-            </w:r>
-          </w:p>
-        </w:tc>
-        <w:tc>
-          <w:tcPr>
-            <w:tcW w:type="dxa" w:w="2102"/>
-            <w:shd w:fill="FFFFFF"/>
-            <w:tcMar>
-              <w:top w:w="80" w:type="dxa"/>
-              <w:bottom w:w="80" w:type="dxa"/>
-              <w:left w:w="120" w:type="dxa"/>
-              <w:right w:w="120" w:type="dxa"/>
-            </w:tcMar>
-          </w:tcPr>
-          <w:p>
-            <w:r>
-              <w:rPr>
-                <w:rFonts w:ascii="Arial" w:hAnsi="Arial"/>
-                <w:b/>
-                <w:color w:val="16A34A"/>
-                <w:sz w:val="16"/>
-              </w:rPr>
-              <w:t>RESOLVED</w:t>
-            </w:r>
-          </w:p>
-        </w:tc>
-      </w:tr>
-      <w:tr>
-        <w:tc>
-          <w:tcPr>
-            <w:tcW w:type="dxa" w:w="2102"/>
-            <w:shd w:fill="F8FAFC"/>
-            <w:tcMar>
-              <w:top w:w="80" w:type="dxa"/>
-              <w:bottom w:w="80" w:type="dxa"/>
-              <w:left w:w="120" w:type="dxa"/>
-              <w:right w:w="120" w:type="dxa"/>
-            </w:tcMar>
-          </w:tcPr>
-          <w:p>
-            <w:r>
-              <w:rPr>
-                <w:rFonts w:ascii="Arial" w:hAnsi="Arial"/>
-                <w:color w:val="0F172A"/>
-                <w:sz w:val="16"/>
-              </w:rPr>
-              <w:t>B010</w:t>
-            </w:r>
-          </w:p>
-        </w:tc>
-        <w:tc>
-          <w:tcPr>
-            <w:tcW w:type="dxa" w:w="2102"/>
-            <w:shd w:fill="F8FAFC"/>
-            <w:tcMar>
-              <w:top w:w="80" w:type="dxa"/>
-              <w:bottom w:w="80" w:type="dxa"/>
-              <w:left w:w="120" w:type="dxa"/>
-              <w:right w:w="120" w:type="dxa"/>
-            </w:tcMar>
-          </w:tcPr>
-          <w:p>
-            <w:r>
-              <w:rPr>
-                <w:rFonts w:ascii="Arial" w:hAnsi="Arial"/>
-                <w:color w:val="0F172A"/>
-                <w:sz w:val="16"/>
-              </w:rPr>
-              <w:t>SolarShop India</w:t>
-            </w:r>
-          </w:p>
-        </w:tc>
-        <w:tc>
-          <w:tcPr>
-            <w:tcW w:type="dxa" w:w="2102"/>
-            <w:shd w:fill="F8FAFC"/>
-            <w:tcMar>
-              <w:top w:w="80" w:type="dxa"/>
-              <w:bottom w:w="80" w:type="dxa"/>
-              <w:left w:w="120" w:type="dxa"/>
-              <w:right w:w="120" w:type="dxa"/>
-            </w:tcMar>
-          </w:tcPr>
-          <w:p>
-            <w:r>
-              <w:rPr>
-                <w:rFonts w:ascii="Arial" w:hAnsi="Arial"/>
-                <w:color w:val="0F172A"/>
-                <w:sz w:val="16"/>
-              </w:rPr>
-              <w:t>SolarShop India landing page was static with no live API connected</w:t>
-            </w:r>
-          </w:p>
-        </w:tc>
-        <w:tc>
-          <w:tcPr>
-            <w:tcW w:type="dxa" w:w="2102"/>
-            <w:shd w:fill="F8FAFC"/>
-            <w:tcMar>
-              <w:top w:w="80" w:type="dxa"/>
-              <w:bottom w:w="80" w:type="dxa"/>
-              <w:left w:w="120" w:type="dxa"/>
-              <w:right w:w="120" w:type="dxa"/>
-            </w:tcMar>
-          </w:tcPr>
-          <w:p>
-            <w:r>
-              <w:rPr>
-                <w:rFonts w:ascii="Arial" w:hAnsi="Arial"/>
-                <w:color w:val="0F172A"/>
-                <w:sz w:val="16"/>
-              </w:rPr>
-              <w:t>FIXED: Connected to dynamic Website Content Management System (industry.content.handler.js, industry_content.schema.js, and BrowseByIndustry.jsx in solar-store and solarshop-india).</w:t>
-            </w:r>
-          </w:p>
-        </w:tc>
-        <w:tc>
-          <w:tcPr>
-            <w:tcW w:type="dxa" w:w="2102"/>
-            <w:shd w:fill="F8FAFC"/>
-            <w:tcMar>
-              <w:top w:w="80" w:type="dxa"/>
-              <w:bottom w:w="80" w:type="dxa"/>
-              <w:left w:w="120" w:type="dxa"/>
-              <w:right w:w="120" w:type="dxa"/>
-            </w:tcMar>
-          </w:tcPr>
-          <w:p>
-            <w:r>
-              <w:rPr>
-                <w:rFonts w:ascii="Arial" w:hAnsi="Arial"/>
-                <w:b/>
-                <w:color w:val="16A34A"/>
-                <w:sz w:val="16"/>
-              </w:rPr>
-              <w:t>RESOLVED</w:t>
-            </w:r>
-          </w:p>
-        </w:tc>
-      </w:tr>
-      <w:tr>
-        <w:tc>
-          <w:tcPr>
-            <w:tcW w:type="dxa" w:w="2102"/>
-            <w:shd w:fill="FFFFFF"/>
-            <w:tcMar>
-              <w:top w:w="80" w:type="dxa"/>
-              <w:bottom w:w="80" w:type="dxa"/>
-              <w:left w:w="120" w:type="dxa"/>
-              <w:right w:w="120" w:type="dxa"/>
-            </w:tcMar>
-          </w:tcPr>
-          <w:p>
-            <w:r>
-              <w:rPr>
-                <w:rFonts w:ascii="Arial" w:hAnsi="Arial"/>
-                <w:color w:val="0F172A"/>
-                <w:sz w:val="16"/>
-              </w:rPr>
-              <w:t>B012</w:t>
-            </w:r>
-          </w:p>
-        </w:tc>
-        <w:tc>
-          <w:tcPr>
-            <w:tcW w:type="dxa" w:w="2102"/>
-            <w:shd w:fill="FFFFFF"/>
-            <w:tcMar>
-              <w:top w:w="80" w:type="dxa"/>
-              <w:bottom w:w="80" w:type="dxa"/>
-              <w:left w:w="120" w:type="dxa"/>
-              <w:right w:w="120" w:type="dxa"/>
-            </w:tcMar>
-          </w:tcPr>
-          <w:p>
-            <w:r>
-              <w:rPr>
-                <w:rFonts w:ascii="Arial" w:hAnsi="Arial"/>
-                <w:color w:val="0F172A"/>
-                <w:sz w:val="16"/>
-              </w:rPr>
-              <w:t>Documentation</w:t>
-            </w:r>
-          </w:p>
-        </w:tc>
-        <w:tc>
-          <w:tcPr>
-            <w:tcW w:type="dxa" w:w="2102"/>
-            <w:shd w:fill="FFFFFF"/>
-            <w:tcMar>
-              <w:top w:w="80" w:type="dxa"/>
-              <w:bottom w:w="80" w:type="dxa"/>
-              <w:left w:w="120" w:type="dxa"/>
-              <w:right w:w="120" w:type="dxa"/>
-            </w:tcMar>
-          </w:tcPr>
-          <w:p>
-            <w:r>
-              <w:rPr>
-                <w:rFonts w:ascii="Arial" w:hAnsi="Arial"/>
-                <w:color w:val="0F172A"/>
-                <w:sz w:val="16"/>
-              </w:rPr>
-              <w:t>Legacy documentation referenced old online payment gateway instead of active architecture</w:t>
-            </w:r>
-          </w:p>
-        </w:tc>
-        <w:tc>
-          <w:tcPr>
-            <w:tcW w:type="dxa" w:w="2102"/>
-            <w:shd w:fill="FFFFFF"/>
-            <w:tcMar>
-              <w:top w:w="80" w:type="dxa"/>
-              <w:bottom w:w="80" w:type="dxa"/>
-              <w:left w:w="120" w:type="dxa"/>
-              <w:right w:w="120" w:type="dxa"/>
-            </w:tcMar>
-          </w:tcPr>
-          <w:p>
-            <w:r>
-              <w:rPr>
-                <w:rFonts w:ascii="Arial" w:hAnsi="Arial"/>
-                <w:color w:val="0F172A"/>
-                <w:sz w:val="16"/>
-              </w:rPr>
-              <w:t>FIXED: All project documentation updated to formally standardize the Hybrid Dual-Track Architecture: Automated ICICI E-Collection (Virtual Accounts) + Offline Bank Transfer &amp; Payment Receipt Verification.</w:t>
+              <w:t>FIXED: All project documentation updated to formally standardize the Hybrid Dual-Track Architecture: Automated ICICI E-Collection (Virtual Accounts) + Offline Bank Transfer &amp; Payment Receipt Verification alongside the 2-Stage Kit Activation &amp; Order Delivery Journey.</w:t>
             </w:r>
           </w:p>
         </w:tc>
@@ -21257,6 +20537,276 @@
                 <w:sz w:val="16"/>
               </w:rPr>
               <w:t>Multer file MIME validation and upload pipeline are functional. Recommending enforcement of Cloudinary authenticated/private signed delivery URLs in production.</w:t>
+            </w:r>
+          </w:p>
+        </w:tc>
+      </w:tr>
+      <w:tr>
+        <w:tc>
+          <w:tcPr>
+            <w:tcW w:type="dxa" w:w="1752"/>
+            <w:shd w:fill="FFFFFF"/>
+            <w:tcMar>
+              <w:top w:w="80" w:type="dxa"/>
+              <w:bottom w:w="80" w:type="dxa"/>
+              <w:left w:w="120" w:type="dxa"/>
+              <w:right w:w="120" w:type="dxa"/>
+            </w:tcMar>
+          </w:tcPr>
+          <w:p>
+            <w:r>
+              <w:rPr>
+                <w:rFonts w:ascii="Arial" w:hAnsi="Arial"/>
+                <w:color w:val="0F172A"/>
+                <w:sz w:val="16"/>
+              </w:rPr>
+              <w:t>B005</w:t>
+            </w:r>
+          </w:p>
+        </w:tc>
+        <w:tc>
+          <w:tcPr>
+            <w:tcW w:type="dxa" w:w="1752"/>
+            <w:shd w:fill="FFFFFF"/>
+            <w:tcMar>
+              <w:top w:w="80" w:type="dxa"/>
+              <w:bottom w:w="80" w:type="dxa"/>
+              <w:left w:w="120" w:type="dxa"/>
+              <w:right w:w="120" w:type="dxa"/>
+            </w:tcMar>
+          </w:tcPr>
+          <w:p>
+            <w:r>
+              <w:rPr>
+                <w:rFonts w:ascii="Arial" w:hAnsi="Arial"/>
+                <w:color w:val="0F172A"/>
+                <w:sz w:val="16"/>
+              </w:rPr>
+              <w:t>Warehouse Logistics</w:t>
+            </w:r>
+          </w:p>
+        </w:tc>
+        <w:tc>
+          <w:tcPr>
+            <w:tcW w:type="dxa" w:w="1752"/>
+            <w:shd w:fill="FFFFFF"/>
+            <w:tcMar>
+              <w:top w:w="80" w:type="dxa"/>
+              <w:bottom w:w="80" w:type="dxa"/>
+              <w:left w:w="120" w:type="dxa"/>
+              <w:right w:w="120" w:type="dxa"/>
+            </w:tcMar>
+          </w:tcPr>
+          <w:p>
+            <w:r>
+              <w:rPr>
+                <w:rFonts w:ascii="Arial" w:hAnsi="Arial"/>
+                <w:color w:val="0F172A"/>
+                <w:sz w:val="16"/>
+              </w:rPr>
+              <w:t>Material Inward 'Order Inward' tab currently hardcoded with placeholder message and missing backend fulfillment matching</w:t>
+            </w:r>
+          </w:p>
+        </w:tc>
+        <w:tc>
+          <w:tcPr>
+            <w:tcW w:type="dxa" w:w="1752"/>
+            <w:shd w:fill="FFFFFF"/>
+            <w:tcMar>
+              <w:top w:w="80" w:type="dxa"/>
+              <w:bottom w:w="80" w:type="dxa"/>
+              <w:left w:w="120" w:type="dxa"/>
+              <w:right w:w="120" w:type="dxa"/>
+            </w:tcMar>
+          </w:tcPr>
+          <w:p>
+            <w:r>
+              <w:rPr>
+                <w:rFonts w:ascii="Arial" w:hAnsi="Arial"/>
+                <w:color w:val="0F172A"/>
+                <w:sz w:val="16"/>
+              </w:rPr>
+              <w:t>internal-admin-portal/src/portals/warehouse/pages/material-inward/MaterialInward.jsx:activeTab === 'supplier'</w:t>
+            </w:r>
+          </w:p>
+        </w:tc>
+        <w:tc>
+          <w:tcPr>
+            <w:tcW w:type="dxa" w:w="1752"/>
+            <w:shd w:fill="FFFFFF"/>
+            <w:tcMar>
+              <w:top w:w="80" w:type="dxa"/>
+              <w:bottom w:w="80" w:type="dxa"/>
+              <w:left w:w="120" w:type="dxa"/>
+              <w:right w:w="120" w:type="dxa"/>
+            </w:tcMar>
+          </w:tcPr>
+          <w:p>
+            <w:r>
+              <w:rPr>
+                <w:rFonts w:ascii="Arial" w:hAnsi="Arial"/>
+                <w:b/>
+                <w:color w:val="D97706"/>
+                <w:sz w:val="16"/>
+              </w:rPr>
+              <w:t>HIGH</w:t>
+            </w:r>
+          </w:p>
+        </w:tc>
+        <w:tc>
+          <w:tcPr>
+            <w:tcW w:type="dxa" w:w="1752"/>
+            <w:shd w:fill="FFFFFF"/>
+            <w:tcMar>
+              <w:top w:w="80" w:type="dxa"/>
+              <w:bottom w:w="80" w:type="dxa"/>
+              <w:left w:w="120" w:type="dxa"/>
+              <w:right w:w="120" w:type="dxa"/>
+            </w:tcMar>
+          </w:tcPr>
+          <w:p>
+            <w:r>
+              <w:rPr>
+                <w:rFonts w:ascii="Arial" w:hAnsi="Arial"/>
+                <w:color w:val="0F172A"/>
+                <w:sz w:val="16"/>
+              </w:rPr>
+              <w:t>Tab 1 (Inventory Inward PO delivery &amp; GRN) is fully operational. Tab 2 (Order Inward) is currently under active development to automatically match received GRN stock to source customer sales orders before releasing to delivery.</w:t>
+            </w:r>
+          </w:p>
+        </w:tc>
+      </w:tr>
+      <w:tr>
+        <w:tc>
+          <w:tcPr>
+            <w:tcW w:type="dxa" w:w="1752"/>
+            <w:shd w:fill="F8FAFC"/>
+            <w:tcMar>
+              <w:top w:w="80" w:type="dxa"/>
+              <w:bottom w:w="80" w:type="dxa"/>
+              <w:left w:w="120" w:type="dxa"/>
+              <w:right w:w="120" w:type="dxa"/>
+            </w:tcMar>
+          </w:tcPr>
+          <w:p>
+            <w:r>
+              <w:rPr>
+                <w:rFonts w:ascii="Arial" w:hAnsi="Arial"/>
+                <w:color w:val="0F172A"/>
+                <w:sz w:val="16"/>
+              </w:rPr>
+              <w:t>B007</w:t>
+            </w:r>
+          </w:p>
+        </w:tc>
+        <w:tc>
+          <w:tcPr>
+            <w:tcW w:type="dxa" w:w="1752"/>
+            <w:shd w:fill="F8FAFC"/>
+            <w:tcMar>
+              <w:top w:w="80" w:type="dxa"/>
+              <w:bottom w:w="80" w:type="dxa"/>
+              <w:left w:w="120" w:type="dxa"/>
+              <w:right w:w="120" w:type="dxa"/>
+            </w:tcMar>
+          </w:tcPr>
+          <w:p>
+            <w:r>
+              <w:rPr>
+                <w:rFonts w:ascii="Arial" w:hAnsi="Arial"/>
+                <w:color w:val="0F172A"/>
+                <w:sz w:val="16"/>
+              </w:rPr>
+              <w:t>Delivery Logistics</w:t>
+            </w:r>
+          </w:p>
+        </w:tc>
+        <w:tc>
+          <w:tcPr>
+            <w:tcW w:type="dxa" w:w="1752"/>
+            <w:shd w:fill="F8FAFC"/>
+            <w:tcMar>
+              <w:top w:w="80" w:type="dxa"/>
+              <w:bottom w:w="80" w:type="dxa"/>
+              <w:left w:w="120" w:type="dxa"/>
+              <w:right w:w="120" w:type="dxa"/>
+            </w:tcMar>
+          </w:tcPr>
+          <w:p>
+            <w:r>
+              <w:rPr>
+                <w:rFonts w:ascii="Arial" w:hAnsi="Arial"/>
+                <w:color w:val="0F172A"/>
+                <w:sz w:val="16"/>
+              </w:rPr>
+              <w:t>Delivery OTP verification and Proof of Delivery (POD) photo upload UI require mobile/field driver optimization</w:t>
+            </w:r>
+          </w:p>
+        </w:tc>
+        <w:tc>
+          <w:tcPr>
+            <w:tcW w:type="dxa" w:w="1752"/>
+            <w:shd w:fill="F8FAFC"/>
+            <w:tcMar>
+              <w:top w:w="80" w:type="dxa"/>
+              <w:bottom w:w="80" w:type="dxa"/>
+              <w:left w:w="120" w:type="dxa"/>
+              <w:right w:w="120" w:type="dxa"/>
+            </w:tcMar>
+          </w:tcPr>
+          <w:p>
+            <w:r>
+              <w:rPr>
+                <w:rFonts w:ascii="Arial" w:hAnsi="Arial"/>
+                <w:color w:val="0F172A"/>
+                <w:sz w:val="16"/>
+              </w:rPr>
+              <w:t>backend/src/modules/admin-panel/models/india_solarshop_db/delivery_order.schema.js</w:t>
+            </w:r>
+          </w:p>
+        </w:tc>
+        <w:tc>
+          <w:tcPr>
+            <w:tcW w:type="dxa" w:w="1752"/>
+            <w:shd w:fill="F8FAFC"/>
+            <w:tcMar>
+              <w:top w:w="80" w:type="dxa"/>
+              <w:bottom w:w="80" w:type="dxa"/>
+              <w:left w:w="120" w:type="dxa"/>
+              <w:right w:w="120" w:type="dxa"/>
+            </w:tcMar>
+          </w:tcPr>
+          <w:p>
+            <w:r>
+              <w:rPr>
+                <w:rFonts w:ascii="Arial" w:hAnsi="Arial"/>
+                <w:b/>
+                <w:color w:val="D97706"/>
+                <w:sz w:val="16"/>
+              </w:rPr>
+              <w:t>MEDIUM</w:t>
+            </w:r>
+          </w:p>
+        </w:tc>
+        <w:tc>
+          <w:tcPr>
+            <w:tcW w:type="dxa" w:w="1752"/>
+            <w:shd w:fill="F8FAFC"/>
+            <w:tcMar>
+              <w:top w:w="80" w:type="dxa"/>
+              <w:bottom w:w="80" w:type="dxa"/>
+              <w:left w:w="120" w:type="dxa"/>
+              <w:right w:w="120" w:type="dxa"/>
+            </w:tcMar>
+          </w:tcPr>
+          <w:p>
+            <w:r>
+              <w:rPr>
+                <w:rFonts w:ascii="Arial" w:hAnsi="Arial"/>
+                <w:color w:val="0F172A"/>
+                <w:sz w:val="16"/>
+              </w:rPr>
+              <w:t>Backend fields for OTP confirmation and Cloudinary POD image attachment are implemented in delivery_order.schema.js. Field UI workflows in Operations Tab 8 are undergoing final mobile responsiveness polish.</w:t>
             </w:r>
           </w:p>
         </w:tc>
@@ -22245,7 +21795,7 @@
                 <w:color w:val="0F172A"/>
                 <w:sz w:val="16"/>
               </w:rPr>
-              <w:t>Backend API (all 10 modules)</w:t>
+              <w:t>Backend API (all 10 domain modules)</w:t>
             </w:r>
           </w:p>
         </w:tc>
@@ -22923,7 +22473,7 @@
                 <w:color w:val="0F172A"/>
                 <w:sz w:val="16"/>
               </w:rPr>
-              <w:t>BOSKIT B2B Platform</w:t>
+              <w:t>Kit Activation &amp; Order Settings</w:t>
             </w:r>
           </w:p>
         </w:tc>
@@ -22945,7 +22495,7 @@
                 <w:color w:val="0F172A"/>
                 <w:sz w:val="16"/>
               </w:rPr>
-              <w:t>68%</w:t>
+              <w:t>75%</w:t>
             </w:r>
           </w:p>
         </w:tc>
@@ -22967,7 +22517,7 @@
                 <w:color w:val="0F172A"/>
                 <w:sz w:val="16"/>
               </w:rPr>
-              <w:t>80%</w:t>
+              <w:t>92%</w:t>
             </w:r>
           </w:p>
         </w:tc>
@@ -22990,7 +22540,7 @@
                 <w:color w:val="16A34A"/>
                 <w:sz w:val="16"/>
               </w:rPr>
-              <w:t>+12.0%</w:t>
+              <w:t>+17.0%</w:t>
             </w:r>
           </w:p>
         </w:tc>
@@ -23012,7 +22562,7 @@
                 <w:color w:val="0F172A"/>
                 <w:sz w:val="16"/>
               </w:rPr>
-              <w:t>Franchise plans re-export verified (1,604 LOC), distributor catalog, dealer ordering</w:t>
+              <w:t>2-stage pipeline: Warehouse 3-gate validation + District sequential fulfillment routing (Sub-WH -&gt; Nearest -&gt; In-Cluster)</w:t>
             </w:r>
           </w:p>
         </w:tc>
@@ -23125,7 +22675,7 @@
                 <w:color w:val="0F172A"/>
                 <w:sz w:val="16"/>
               </w:rPr>
-              <w:t>Dual-track engine: ICICI Automated E-Collection + Offline Bank Transfer &amp; Verification</w:t>
+              <w:t>Multi-Order Supplier PO combination modal, ICICI Automated E-Collection + Offline Bank Transfer &amp; Verification</w:t>
             </w:r>
           </w:p>
         </w:tc>
@@ -23238,7 +22788,7 @@
                 <w:color w:val="0F172A"/>
                 <w:sz w:val="16"/>
               </w:rPr>
-              <w:t>Inward logging, stock reservation, fleet drivers/vehicles, repair ticket schema</w:t>
+              <w:t>Material Inward GRN logging, supplier PO delivery, FIFO BOM allocation, fleet drivers/vehicles, repair ticket schema</w:t>
             </w:r>
           </w:p>
         </w:tc>
@@ -23262,7 +22812,7 @@
                 <w:color w:val="0F172A"/>
                 <w:sz w:val="16"/>
               </w:rPr>
-              <w:t>Operations Module</w:t>
+              <w:t>Operations &amp; Delivery Module</w:t>
             </w:r>
           </w:p>
         </w:tc>
@@ -23306,7 +22856,7 @@
                 <w:color w:val="0F172A"/>
                 <w:sz w:val="16"/>
               </w:rPr>
-              <w:t>80%</w:t>
+              <w:t>82%</w:t>
             </w:r>
           </w:p>
         </w:tc>
@@ -23329,7 +22879,7 @@
                 <w:color w:val="16A34A"/>
                 <w:sz w:val="16"/>
               </w:rPr>
-              <w:t>+50.0%</w:t>
+              <w:t>+52.0%</w:t>
             </w:r>
           </w:p>
         </w:tc>
@@ -23351,7 +22901,7 @@
                 <w:color w:val="0F172A"/>
                 <w:sz w:val="16"/>
               </w:rPr>
-              <w:t>Delivery Queue Tab 7, Trip Tracking Tab 8, automated vehicle recommendation engine</w:t>
+              <w:t>8-Stage delivery pipeline, Delivery Queue Tab 7, Trip POD Tab 8, automated vehicle recommendation engine</w:t>
             </w:r>
           </w:p>
         </w:tc>
@@ -23375,7 +22925,7 @@
                 <w:color w:val="0F172A"/>
                 <w:sz w:val="16"/>
               </w:rPr>
-              <w:t>Reports &amp; Analytics</w:t>
+              <w:t>Reports &amp; Logistics Analytics</w:t>
             </w:r>
           </w:p>
         </w:tc>
@@ -23464,7 +23014,7 @@
                 <w:color w:val="0F172A"/>
                 <w:sz w:val="16"/>
               </w:rPr>
-              <w:t>BDE conversion funnel, monthly target tracking, delivery TAT and cargo metrics</w:t>
+              <w:t>BDE conversion funnel, monthly target tracking, delivery TAT and warehouse turnaround metrics</w:t>
             </w:r>
           </w:p>
         </w:tc>
@@ -23690,7 +23240,7 @@
                 <w:color w:val="0F172A"/>
                 <w:sz w:val="16"/>
               </w:rPr>
-              <w:t>Production-ready stage; major commercial supply chain &amp; banking integrations complete</w:t>
+              <w:t>Production-ready stage; major commercial supply chain, 2-stage kit activation &amp; banking integrations complete</w:t>
             </w:r>
           </w:p>
         </w:tc>

</xml_diff>